<commit_message>
Replace MTCNN with SCRFD as the face detector; update related documentation and configurations
</commit_message>
<xml_diff>
--- a/Surveillance-Antz-Technical-Documentation.docx
+++ b/Surveillance-Antz-Technical-Documentation.docx
@@ -1540,7 +1540,7 @@
               <w:rPr>
                 <w:sz w:val="18"/>
               </w:rPr>
-              <w:t>MTCNN (facenet-pytorch)</w:t>
+              <w:t>SCRFD 500m-bnkps (was MTCNN)</w:t>
             </w:r>
           </w:p>
         </w:tc>
@@ -1568,7 +1568,7 @@
               <w:rPr>
                 <w:sz w:val="18"/>
               </w:rPr>
-              <w:t>Part 1 face_extractor.py (detector, NOT recogniser)</w:t>
+              <w:t>Part 1 scrfd_detector.py (onnxruntime); FACE_DETECTOR=mtcnn reverts</w:t>
             </w:r>
           </w:p>
         </w:tc>
@@ -1769,7 +1769,92 @@
         <w:rPr>
           <w:b/>
         </w:rPr>
-        <w:t>Alternate detector backends</w:t>
+        <w:t>Face detector — history:</w:t>
+      </w:r>
+      <w:r>
+        <w:t xml:space="preserve"> the face-detection + 5-landmark stage </w:t>
+      </w:r>
+      <w:r>
+        <w:rPr>
+          <w:b/>
+        </w:rPr>
+        <w:t>was MTCNN</w:t>
+      </w:r>
+      <w:r>
+        <w:t xml:space="preserve"> (facenet-pytorch, torch-based) and is </w:t>
+      </w:r>
+      <w:r>
+        <w:rPr>
+          <w:b/>
+        </w:rPr>
+        <w:t>now SCRFD</w:t>
+      </w:r>
+      <w:r>
+        <w:t xml:space="preserve"> (</w:t>
+      </w:r>
+      <w:r>
+        <w:rPr>
+          <w:rFonts w:ascii="Consolas" w:hAnsi="Consolas"/>
+          <w:color w:val="A03030"/>
+          <w:sz w:val="19"/>
+        </w:rPr>
+        <w:t>scrfd_500m_bnkps.onnx</w:t>
+      </w:r>
+      <w:r>
+        <w:t xml:space="preserve"> run via onnxruntime in </w:t>
+      </w:r>
+      <w:r>
+        <w:rPr>
+          <w:rFonts w:ascii="Consolas" w:hAnsi="Consolas"/>
+          <w:color w:val="A03030"/>
+          <w:sz w:val="19"/>
+        </w:rPr>
+        <w:t>feature_id/scrfd_detector.py</w:t>
+      </w:r>
+      <w:r>
+        <w:t xml:space="preserve">) — faster and better on small/angled CCTV faces, with no torch dependency. It is switchable via </w:t>
+      </w:r>
+      <w:r>
+        <w:rPr>
+          <w:rFonts w:ascii="Consolas" w:hAnsi="Consolas"/>
+          <w:color w:val="A03030"/>
+          <w:sz w:val="19"/>
+        </w:rPr>
+        <w:t>FACE_DETECTOR</w:t>
+      </w:r>
+      <w:r>
+        <w:t xml:space="preserve"> (</w:t>
+      </w:r>
+      <w:r>
+        <w:rPr>
+          <w:rFonts w:ascii="Consolas" w:hAnsi="Consolas"/>
+          <w:color w:val="A03030"/>
+          <w:sz w:val="19"/>
+        </w:rPr>
+        <w:t>scrfd</w:t>
+      </w:r>
+      <w:r>
+        <w:t xml:space="preserve"> default, </w:t>
+      </w:r>
+      <w:r>
+        <w:rPr>
+          <w:rFonts w:ascii="Consolas" w:hAnsi="Consolas"/>
+          <w:color w:val="A03030"/>
+          <w:sz w:val="19"/>
+        </w:rPr>
+        <w:t>mtcnn</w:t>
+      </w:r>
+      <w:r>
+        <w:t xml:space="preserve"> to revert). In both cases recognition remains AdaFace; only the 'where is the face' stage changed.</w:t>
+      </w:r>
+    </w:p>
+    <w:p>
+      <w:r/>
+      <w:r>
+        <w:rPr>
+          <w:b/>
+        </w:rPr>
+        <w:t>Alternate person-detector backends</w:t>
       </w:r>
       <w:r>
         <w:t xml:space="preserve"> (env </w:t>
@@ -1811,7 +1896,7 @@
         <w:rPr>
           <w:b/>
         </w:rPr>
-        <w:t>Present on disk but UNUSED by any code:</w:t>
+        <w:t>Present on disk but still UNUSED by any code:</w:t>
       </w:r>
       <w:r>
         <w:t xml:space="preserve"> </w:t>
@@ -1825,18 +1910,7 @@
         <w:t>yolo11s.{engine,onnx,pt}</w:t>
       </w:r>
       <w:r>
-        <w:t xml:space="preserve"> and </w:t>
-      </w:r>
-      <w:r>
-        <w:rPr>
-          <w:rFonts w:ascii="Consolas" w:hAnsi="Consolas"/>
-          <w:color w:val="A03030"/>
-          <w:sz w:val="19"/>
-        </w:rPr>
-        <w:t>scrfd_500m_bnkps.onnx</w:t>
-      </w:r>
-      <w:r>
-        <w:t xml:space="preserve"> — staged/experimental artifacts; the README explicitly states detection uses RT-DETR, 'no YOLO', and face detection is MTCNN.</w:t>
+        <w:t xml:space="preserve"> — staged/experimental; the README states detection uses RT-DETR, 'no YOLO'.</w:t>
       </w:r>
     </w:p>
     <w:p>
@@ -3515,7 +3589,36 @@
     </w:p>
     <w:p>
       <w:r>
-        <w:t>Crop → 512-d face embedding, or None when no usable face. Pipeline: MTCNN detect + 5-pt landmarks → ArcFace 112×112 affine alignment (</w:t>
+        <w:t xml:space="preserve">Crop → 512-d face embedding, or None when no usable face. Pipeline: </w:t>
+      </w:r>
+      <w:r>
+        <w:rPr>
+          <w:b/>
+        </w:rPr>
+        <w:t>SCRFD</w:t>
+      </w:r>
+      <w:r>
+        <w:t xml:space="preserve"> detect + 5-pt landmarks (</w:t>
+      </w:r>
+      <w:r>
+        <w:rPr>
+          <w:b/>
+        </w:rPr>
+        <w:t>was MTCNN</w:t>
+      </w:r>
+      <w:r>
+        <w:t xml:space="preserve">; </w:t>
+      </w:r>
+      <w:r>
+        <w:rPr>
+          <w:rFonts w:ascii="Consolas" w:hAnsi="Consolas"/>
+          <w:color w:val="A03030"/>
+          <w:sz w:val="19"/>
+        </w:rPr>
+        <w:t>feature_id/scrfd_detector.py</w:t>
+      </w:r>
+      <w:r>
+        <w:t>, onnxruntime) → ArcFace 112×112 affine alignment (</w:t>
       </w:r>
       <w:r>
         <w:rPr>
@@ -12658,18 +12761,27 @@
         <w:t>models/yolo11s.{engine,onnx,pt}</w:t>
       </w:r>
       <w:r>
-        <w:t xml:space="preserve"> and </w:t>
-      </w:r>
-      <w:r>
-        <w:rPr>
-          <w:rFonts w:ascii="Consolas" w:hAnsi="Consolas"/>
-          <w:color w:val="A03030"/>
-          <w:sz w:val="19"/>
-        </w:rPr>
-        <w:t>models/scrfd_500m_bnkps.onnx</w:t>
-      </w:r>
-      <w:r>
-        <w:t xml:space="preserve"> exist on disk but are referenced by no code. Detection is RT-DETR; face detection is MTCNN.</w:t>
+        <w:t xml:space="preserve"> exist on disk but are referenced by no code (person detection is RT-DETR, 'no YOLO'). Note: </w:t>
+      </w:r>
+      <w:r>
+        <w:rPr>
+          <w:rFonts w:ascii="Consolas" w:hAnsi="Consolas"/>
+          <w:color w:val="A03030"/>
+          <w:sz w:val="19"/>
+        </w:rPr>
+        <w:t>scrfd_500m_bnkps.onnx</w:t>
+      </w:r>
+      <w:r>
+        <w:t xml:space="preserve"> is </w:t>
+      </w:r>
+      <w:r>
+        <w:rPr>
+          <w:b/>
+        </w:rPr>
+        <w:t>no longer unused</w:t>
+      </w:r>
+      <w:r>
+        <w:t xml:space="preserve"> — it is now the active face detector (see §5).</w:t>
       </w:r>
     </w:p>
     <w:p>
@@ -13207,7 +13319,7 @@
               <w:rPr>
                 <w:sz w:val="18"/>
               </w:rPr>
-              <w:t>MTCNN + AdaFace → 512-d face embedding</w:t>
+              <w:t>SCRFD/MTCNN detect + AdaFace → 512-d face embedding</w:t>
             </w:r>
           </w:p>
         </w:tc>
@@ -13223,7 +13335,7 @@
               <w:rPr>
                 <w:sz w:val="18"/>
               </w:rPr>
-              <w:t>surveillance_AI/feature_id/extractor.py</w:t>
+              <w:t>surveillance_AI/feature_id/scrfd_detector.py</w:t>
             </w:r>
           </w:p>
         </w:tc>
@@ -13237,7 +13349,7 @@
               <w:rPr>
                 <w:sz w:val="18"/>
               </w:rPr>
-              <w:t>OSNet → 512-d body embedding</w:t>
+              <w:t>SCRFD ONNX face detector (bbox + 5 landmarks)</w:t>
             </w:r>
           </w:p>
         </w:tc>
@@ -13253,7 +13365,7 @@
               <w:rPr>
                 <w:sz w:val="18"/>
               </w:rPr>
-              <w:t>surveillance_AI/feature_id/gallery.py</w:t>
+              <w:t>surveillance_AI/feature_id/extractor.py</w:t>
             </w:r>
           </w:p>
         </w:tc>
@@ -13267,7 +13379,7 @@
               <w:rPr>
                 <w:sz w:val="18"/>
               </w:rPr>
-              <w:t>local JSON known-people gallery</w:t>
+              <w:t>OSNet → 512-d body embedding</w:t>
             </w:r>
           </w:p>
         </w:tc>
@@ -13283,7 +13395,7 @@
               <w:rPr>
                 <w:sz w:val="18"/>
               </w:rPr>
-              <w:t>surveillance_AI/feature_id/identify.py</w:t>
+              <w:t>surveillance_AI/feature_id/gallery.py</w:t>
             </w:r>
           </w:p>
         </w:tc>
@@ -13297,7 +13409,7 @@
               <w:rPr>
                 <w:sz w:val="18"/>
               </w:rPr>
-              <w:t>Identifier: face-primary/body-fallback decision</w:t>
+              <w:t>local JSON known-people gallery</w:t>
             </w:r>
           </w:p>
         </w:tc>
@@ -13313,7 +13425,7 @@
               <w:rPr>
                 <w:sz w:val="18"/>
               </w:rPr>
-              <w:t>surveillance_AI/feature_id/enroll.py</w:t>
+              <w:t>surveillance_AI/feature_id/identify.py</w:t>
             </w:r>
           </w:p>
         </w:tc>
@@ -13327,7 +13439,7 @@
               <w:rPr>
                 <w:sz w:val="18"/>
               </w:rPr>
-              <w:t>CLI enroll employee into local gallery</w:t>
+              <w:t>Identifier: face-primary/body-fallback decision</w:t>
             </w:r>
           </w:p>
         </w:tc>
@@ -13343,7 +13455,7 @@
               <w:rPr>
                 <w:sz w:val="18"/>
               </w:rPr>
-              <w:t>surveillance_AI/feature_id/demo.py</w:t>
+              <w:t>surveillance_AI/feature_id/enroll.py</w:t>
             </w:r>
           </w:p>
         </w:tc>
@@ -13357,7 +13469,7 @@
               <w:rPr>
                 <w:sz w:val="18"/>
               </w:rPr>
-              <w:t>offline synthetic self-test</w:t>
+              <w:t>CLI enroll employee into local gallery</w:t>
             </w:r>
           </w:p>
         </w:tc>
@@ -13373,7 +13485,7 @@
               <w:rPr>
                 <w:sz w:val="18"/>
               </w:rPr>
-              <w:t>surveillance_AI/feature_id/data/gallery.json</w:t>
+              <w:t>surveillance_AI/feature_id/demo.py</w:t>
             </w:r>
           </w:p>
         </w:tc>
@@ -13387,7 +13499,7 @@
               <w:rPr>
                 <w:sz w:val="18"/>
               </w:rPr>
-              <w:t>the local gallery data file</w:t>
+              <w:t>offline synthetic self-test</w:t>
             </w:r>
           </w:p>
         </w:tc>
@@ -13403,6 +13515,36 @@
               <w:rPr>
                 <w:sz w:val="18"/>
               </w:rPr>
+              <w:t>surveillance_AI/feature_id/data/gallery.json</w:t>
+            </w:r>
+          </w:p>
+        </w:tc>
+        <w:tc>
+          <w:tcPr>
+            <w:tcW w:type="dxa" w:w="4752"/>
+          </w:tcPr>
+          <w:p>
+            <w:r/>
+            <w:r>
+              <w:rPr>
+                <w:sz w:val="18"/>
+              </w:rPr>
+              <w:t>the local gallery data file</w:t>
+            </w:r>
+          </w:p>
+        </w:tc>
+      </w:tr>
+      <w:tr>
+        <w:tc>
+          <w:tcPr>
+            <w:tcW w:type="dxa" w:w="4464"/>
+          </w:tcPr>
+          <w:p>
+            <w:r/>
+            <w:r>
+              <w:rPr>
+                <w:sz w:val="18"/>
+              </w:rPr>
               <w:t>surveillance_AI/models/*</w:t>
             </w:r>
           </w:p>
@@ -13417,7 +13559,7 @@
               <w:rPr>
                 <w:sz w:val="18"/>
               </w:rPr>
-              <w:t>AdaFace, OSNet, SAM2 weights (+ unused yolo/scrfd)</w:t>
+              <w:t>AdaFace, OSNet, SAM2, SCRFD weights (+ unused yolo11s)</w:t>
             </w:r>
           </w:p>
         </w:tc>

</xml_diff>

<commit_message>
Implement tiered retention for media and event data; add durable profile photo handling
</commit_message>
<xml_diff>
--- a/Surveillance-Antz-Technical-Documentation.docx
+++ b/Surveillance-Antz-Technical-Documentation.docx
@@ -78,7 +78,7 @@
         <w:rPr>
           <w:sz w:val="20"/>
         </w:rPr>
-        <w:t>Revision 2 · Generated 2026-07-16 · Branch live-integration-gpu</w:t>
+        <w:t>Revision 3 · Generated 2026-07-16 · Branch live-integration-gpu</w:t>
         <w:br/>
       </w:r>
       <w:r>
@@ -86,7 +86,7 @@
           <w:color w:val="555555"/>
           <w:sz w:val="20"/>
         </w:rPr>
-        <w:t>Reflects the actual on-disk state of the repository, including the SCRFD swap, the promote fix, and the modularization.</w:t>
+        <w:t>Reflects the actual on-disk state: the SCRFD swap, the promote fix, the modularization, and the Tier A/B storage rework.</w:t>
       </w:r>
     </w:p>
     <w:p>
@@ -8309,7 +8309,7 @@
               <w:rPr>
                 <w:sz w:val="17"/>
               </w:rPr>
-              <w:t>RETENTION_DAYS</w:t>
+              <w:t>MEDIA_RETENTION_DAYS</w:t>
             </w:r>
           </w:p>
         </w:tc>
@@ -8328,7 +8328,7 @@
               <w:rPr>
                 <w:sz w:val="17"/>
               </w:rPr>
-              <w:t>7</w:t>
+              <w:t>30</w:t>
             </w:r>
           </w:p>
         </w:tc>
@@ -8347,7 +8347,122 @@
               <w:rPr>
                 <w:sz w:val="17"/>
               </w:rPr>
-              <w:t>prune detection_events older than N days</w:t>
+              <w:t>age window for storage/img sighting JPEGs (Tier B)</w:t>
+            </w:r>
+          </w:p>
+        </w:tc>
+      </w:tr>
+      <w:tr>
+        <w:tc>
+          <w:tcPr>
+            <w:tcW w:type="dxa" w:w="3744"/>
+          </w:tcPr>
+          <w:p>
+            <w:r>
+              <w:rPr>
+                <w:sz w:val="17"/>
+              </w:rPr>
+            </w:r>
+            <w:r>
+              <w:rPr>
+                <w:sz w:val="17"/>
+              </w:rPr>
+              <w:t>EVENT_RETENTION_DAYS</w:t>
+            </w:r>
+          </w:p>
+        </w:tc>
+        <w:tc>
+          <w:tcPr>
+            <w:tcW w:type="dxa" w:w="2160"/>
+          </w:tcPr>
+          <w:p>
+            <w:r>
+              <w:rPr>
+                <w:sz w:val="17"/>
+              </w:rPr>
+            </w:r>
+            <w:r>
+              <w:rPr>
+                <w:sz w:val="17"/>
+              </w:rPr>
+              <w:t>365</w:t>
+            </w:r>
+          </w:p>
+        </w:tc>
+        <w:tc>
+          <w:tcPr>
+            <w:tcW w:type="dxa" w:w="3456"/>
+          </w:tcPr>
+          <w:p>
+            <w:r>
+              <w:rPr>
+                <w:sz w:val="17"/>
+              </w:rPr>
+            </w:r>
+            <w:r>
+              <w:rPr>
+                <w:sz w:val="17"/>
+              </w:rPr>
+              <w:t>age window for detection_events ROWS (kept long)</w:t>
+            </w:r>
+          </w:p>
+        </w:tc>
+      </w:tr>
+      <w:tr>
+        <w:tc>
+          <w:tcPr>
+            <w:tcW w:type="dxa" w:w="3744"/>
+            <w:shd w:val="clear" w:fill="F3F7F3"/>
+          </w:tcPr>
+          <w:p>
+            <w:r>
+              <w:rPr>
+                <w:sz w:val="17"/>
+              </w:rPr>
+            </w:r>
+            <w:r>
+              <w:rPr>
+                <w:sz w:val="17"/>
+              </w:rPr>
+              <w:t>STORAGE_MAX_GB</w:t>
+            </w:r>
+          </w:p>
+        </w:tc>
+        <w:tc>
+          <w:tcPr>
+            <w:tcW w:type="dxa" w:w="2160"/>
+            <w:shd w:val="clear" w:fill="F3F7F3"/>
+          </w:tcPr>
+          <w:p>
+            <w:r>
+              <w:rPr>
+                <w:sz w:val="17"/>
+              </w:rPr>
+            </w:r>
+            <w:r>
+              <w:rPr>
+                <w:sz w:val="17"/>
+              </w:rPr>
+              <w:t>50</w:t>
+            </w:r>
+          </w:p>
+        </w:tc>
+        <w:tc>
+          <w:tcPr>
+            <w:tcW w:type="dxa" w:w="3456"/>
+            <w:shd w:val="clear" w:fill="F3F7F3"/>
+          </w:tcPr>
+          <w:p>
+            <w:r>
+              <w:rPr>
+                <w:sz w:val="17"/>
+              </w:rPr>
+            </w:r>
+            <w:r>
+              <w:rPr>
+                <w:sz w:val="17"/>
+              </w:rPr>
+              <w:t>hard size backstop on storage/img</w:t>
             </w:r>
           </w:p>
         </w:tc>
@@ -9256,7 +9371,7 @@
               <w:rPr>
                 <w:b/>
               </w:rPr>
-              <w:t>“Last seen —” with no photo</w:t>
+              <w:t>“Last seen —”</w:t>
             </w:r>
             <w:r>
               <w:t xml:space="preserve"> — the data is NOT lost (it's in the DB and in </w:t>
@@ -9271,6 +9386,100 @@
             </w:r>
             <w:r>
               <w:t>), it's just outside the hydration snapshot. Fixing the over-merge shrinks the ledger so everyone fits.</w:t>
+            </w:r>
+          </w:p>
+        </w:tc>
+      </w:tr>
+    </w:tbl>
+    <w:p>
+      <w:pPr>
+        <w:spacing w:after="40"/>
+      </w:pPr>
+    </w:p>
+    <w:tbl>
+      <w:tblPr>
+        <w:tblStyle w:val="TableGrid"/>
+        <w:tblW w:type="auto" w:w="0"/>
+        <w:tblLook w:firstColumn="1" w:firstRow="1" w:lastColumn="0" w:lastRow="0" w:noHBand="0" w:noVBand="1" w:val="04A0"/>
+      </w:tblPr>
+      <w:tblGrid>
+        <w:gridCol w:w="9792"/>
+      </w:tblGrid>
+      <w:tr>
+        <w:tc>
+          <w:tcPr>
+            <w:tcW w:type="dxa" w:w="9792"/>
+            <w:shd w:val="clear" w:fill="EEEEEE"/>
+          </w:tcPr>
+          <w:p>
+            <w:pPr>
+              <w:spacing w:after="40" w:before="20"/>
+            </w:pPr>
+            <w:r>
+              <w:rPr>
+                <w:b/>
+                <w:color w:val="555555"/>
+                <w:sz w:val="18"/>
+              </w:rPr>
+              <w:t>HOW IT WORKS</w:t>
+            </w:r>
+          </w:p>
+          <w:p>
+            <w:pPr>
+              <w:spacing w:after="0" w:before="20"/>
+            </w:pPr>
+            <w:r>
+              <w:rPr>
+                <w:b/>
+              </w:rPr>
+              <w:t>The identity photo is now durable (Tier A — §17, §20).</w:t>
+            </w:r>
+            <w:r>
+              <w:t xml:space="preserve"> </w:t>
+            </w:r>
+            <w:r>
+              <w:rPr>
+                <w:rFonts w:ascii="Consolas" w:hAnsi="Consolas"/>
+                <w:color w:val="A03030"/>
+                <w:sz w:val="19"/>
+              </w:rPr>
+              <w:t>photoFor()</w:t>
+            </w:r>
+            <w:r>
+              <w:t xml:space="preserve"> prefers the Brain's </w:t>
+            </w:r>
+            <w:r>
+              <w:rPr>
+                <w:rFonts w:ascii="Consolas" w:hAnsi="Consolas"/>
+                <w:color w:val="A03030"/>
+                <w:sz w:val="19"/>
+              </w:rPr>
+              <w:t>profile</w:t>
+            </w:r>
+            <w:r>
+              <w:t xml:space="preserve"> field (</w:t>
+            </w:r>
+            <w:r>
+              <w:rPr>
+                <w:rFonts w:ascii="Consolas" w:hAnsi="Consolas"/>
+                <w:color w:val="A03030"/>
+                <w:sz w:val="19"/>
+              </w:rPr>
+              <w:t>storage/profiles/&lt;id&gt;.jpg</w:t>
+            </w:r>
+            <w:r>
+              <w:t xml:space="preserve">, never pruned) over the per-sighting </w:t>
+            </w:r>
+            <w:r>
+              <w:rPr>
+                <w:rFonts w:ascii="Consolas" w:hAnsi="Consolas"/>
+                <w:color w:val="A03030"/>
+                <w:sz w:val="19"/>
+              </w:rPr>
+              <w:t>snapshot</w:t>
+            </w:r>
+            <w:r>
+              <w:t xml:space="preserve"> (which can age out), then a live camera still, then initials. So a person's face no longer disappears from the Report/Records when their old sighting frames are pruned.</w:t>
             </w:r>
           </w:p>
         </w:tc>
@@ -9662,6 +9871,20 @@
         <w:t>17. Consolidated Storage Model</w:t>
       </w:r>
     </w:p>
+    <w:p>
+      <w:r>
+        <w:t xml:space="preserve">Storage is organised into </w:t>
+      </w:r>
+      <w:r>
+        <w:rPr>
+          <w:b/>
+        </w:rPr>
+        <w:t>tiers with different retention</w:t>
+      </w:r>
+      <w:r>
+        <w:t xml:space="preserve"> (the 2026-07-16 rework — §20), so records and identity photos never vanish while bulk media stays bounded:</w:t>
+      </w:r>
+    </w:p>
     <w:tbl>
       <w:tblPr>
         <w:tblStyle w:val="TableGrid"/>
@@ -9677,7 +9900,7 @@
       <w:tr>
         <w:tc>
           <w:tcPr>
-            <w:tcW w:type="dxa" w:w="2016"/>
+            <w:tcW w:type="dxa" w:w="2448"/>
             <w:shd w:val="clear" w:fill="2E7D32"/>
           </w:tcPr>
           <w:p>
@@ -9688,13 +9911,13 @@
                 <w:color w:val="FFFFFF"/>
                 <w:sz w:val="18"/>
               </w:rPr>
-              <w:t>Store</w:t>
-            </w:r>
-          </w:p>
-        </w:tc>
-        <w:tc>
-          <w:tcPr>
-            <w:tcW w:type="dxa" w:w="4752"/>
+              <w:t>Store / tier</w:t>
+            </w:r>
+          </w:p>
+        </w:tc>
+        <w:tc>
+          <w:tcPr>
+            <w:tcW w:type="dxa" w:w="4320"/>
             <w:shd w:val="clear" w:fill="2E7D32"/>
           </w:tcPr>
           <w:p>
@@ -9711,7 +9934,7 @@
         </w:tc>
         <w:tc>
           <w:tcPr>
-            <w:tcW w:type="dxa" w:w="2736"/>
+            <w:tcW w:type="dxa" w:w="2880"/>
             <w:shd w:val="clear" w:fill="2E7D32"/>
           </w:tcPr>
           <w:p>
@@ -9730,25 +9953,25 @@
       <w:tr>
         <w:tc>
           <w:tcPr>
-            <w:tcW w:type="dxa" w:w="2016"/>
-          </w:tcPr>
-          <w:p>
-            <w:r>
-              <w:rPr>
-                <w:sz w:val="17"/>
-              </w:rPr>
-            </w:r>
-            <w:r>
-              <w:rPr>
-                <w:sz w:val="17"/>
-              </w:rPr>
-              <w:t>PostgreSQL</w:t>
-            </w:r>
-          </w:p>
-        </w:tc>
-        <w:tc>
-          <w:tcPr>
-            <w:tcW w:type="dxa" w:w="4752"/>
+            <w:tcW w:type="dxa" w:w="2448"/>
+          </w:tcPr>
+          <w:p>
+            <w:r>
+              <w:rPr>
+                <w:sz w:val="17"/>
+              </w:rPr>
+            </w:r>
+            <w:r>
+              <w:rPr>
+                <w:sz w:val="17"/>
+              </w:rPr>
+              <w:t>PostgreSQL (records)</w:t>
+            </w:r>
+          </w:p>
+        </w:tc>
+        <w:tc>
+          <w:tcPr>
+            <w:tcW w:type="dxa" w:w="4320"/>
           </w:tcPr>
           <w:p>
             <w:r>
@@ -9766,19 +9989,19 @@
         </w:tc>
         <w:tc>
           <w:tcPr>
-            <w:tcW w:type="dxa" w:w="2736"/>
-          </w:tcPr>
-          <w:p>
-            <w:r>
-              <w:rPr>
-                <w:sz w:val="17"/>
-              </w:rPr>
-            </w:r>
-            <w:r>
-              <w:rPr>
-                <w:sz w:val="17"/>
-              </w:rPr>
-              <w:t>permanent (events pruned &gt; 7 days)</w:t>
+            <w:tcW w:type="dxa" w:w="2880"/>
+          </w:tcPr>
+          <w:p>
+            <w:r>
+              <w:rPr>
+                <w:sz w:val="17"/>
+              </w:rPr>
+            </w:r>
+            <w:r>
+              <w:rPr>
+                <w:sz w:val="17"/>
+              </w:rPr>
+              <w:t>kept long — event rows pruned only &gt; EVENT_RETENTION_DAYS (365)</w:t>
             </w:r>
           </w:p>
         </w:tc>
@@ -9786,7 +10009,7 @@
       <w:tr>
         <w:tc>
           <w:tcPr>
-            <w:tcW w:type="dxa" w:w="2016"/>
+            <w:tcW w:type="dxa" w:w="2448"/>
             <w:shd w:val="clear" w:fill="F3F7F3"/>
           </w:tcPr>
           <w:p>
@@ -9799,13 +10022,13 @@
               <w:rPr>
                 <w:sz w:val="17"/>
               </w:rPr>
-              <w:t>Qdrant</w:t>
-            </w:r>
-          </w:p>
-        </w:tc>
-        <w:tc>
-          <w:tcPr>
-            <w:tcW w:type="dxa" w:w="4752"/>
+              <w:t>Qdrant (embeddings)</w:t>
+            </w:r>
+          </w:p>
+        </w:tc>
+        <w:tc>
+          <w:tcPr>
+            <w:tcW w:type="dxa" w:w="4320"/>
             <w:shd w:val="clear" w:fill="F3F7F3"/>
           </w:tcPr>
           <w:p>
@@ -9824,7 +10047,7 @@
         </w:tc>
         <w:tc>
           <w:tcPr>
-            <w:tcW w:type="dxa" w:w="2736"/>
+            <w:tcW w:type="dxa" w:w="2880"/>
             <w:shd w:val="clear" w:fill="F3F7F3"/>
           </w:tcPr>
           <w:p>
@@ -9845,55 +10068,55 @@
       <w:tr>
         <w:tc>
           <w:tcPr>
-            <w:tcW w:type="dxa" w:w="2016"/>
-          </w:tcPr>
-          <w:p>
-            <w:r>
-              <w:rPr>
-                <w:sz w:val="17"/>
-              </w:rPr>
-            </w:r>
-            <w:r>
-              <w:rPr>
-                <w:sz w:val="17"/>
-              </w:rPr>
-              <w:t>Redis</w:t>
-            </w:r>
-          </w:p>
-        </w:tc>
-        <w:tc>
-          <w:tcPr>
-            <w:tcW w:type="dxa" w:w="4752"/>
-          </w:tcPr>
-          <w:p>
-            <w:r>
-              <w:rPr>
-                <w:sz w:val="17"/>
-              </w:rPr>
-            </w:r>
-            <w:r>
-              <w:rPr>
-                <w:sz w:val="17"/>
-              </w:rPr>
-              <w:t>presence:current:{id} (TTL 300s); trackid:{detection_id} (TTL 900s); dedup:* (TTL 30s)</w:t>
-            </w:r>
-          </w:p>
-        </w:tc>
-        <w:tc>
-          <w:tcPr>
-            <w:tcW w:type="dxa" w:w="2736"/>
-          </w:tcPr>
-          <w:p>
-            <w:r>
-              <w:rPr>
-                <w:sz w:val="17"/>
-              </w:rPr>
-            </w:r>
-            <w:r>
-              <w:rPr>
-                <w:sz w:val="17"/>
-              </w:rPr>
-              <w:t>ephemeral</w:t>
+            <w:tcW w:type="dxa" w:w="2448"/>
+          </w:tcPr>
+          <w:p>
+            <w:r>
+              <w:rPr>
+                <w:sz w:val="17"/>
+              </w:rPr>
+            </w:r>
+            <w:r>
+              <w:rPr>
+                <w:sz w:val="17"/>
+              </w:rPr>
+              <w:t>storage/profiles/&lt;id&gt;.jpg  (Tier A)</w:t>
+            </w:r>
+          </w:p>
+        </w:tc>
+        <w:tc>
+          <w:tcPr>
+            <w:tcW w:type="dxa" w:w="4320"/>
+          </w:tcPr>
+          <w:p>
+            <w:r>
+              <w:rPr>
+                <w:sz w:val="17"/>
+              </w:rPr>
+            </w:r>
+            <w:r>
+              <w:rPr>
+                <w:sz w:val="17"/>
+              </w:rPr>
+              <w:t>ONE durable representative photo per identity</w:t>
+            </w:r>
+          </w:p>
+        </w:tc>
+        <w:tc>
+          <w:tcPr>
+            <w:tcW w:type="dxa" w:w="2880"/>
+          </w:tcPr>
+          <w:p>
+            <w:r>
+              <w:rPr>
+                <w:sz w:val="17"/>
+              </w:rPr>
+            </w:r>
+            <w:r>
+              <w:rPr>
+                <w:sz w:val="17"/>
+              </w:rPr>
+              <w:t>NEVER pruned (outside storage/img); the UI's identity face</w:t>
             </w:r>
           </w:p>
         </w:tc>
@@ -9901,7 +10124,7 @@
       <w:tr>
         <w:tc>
           <w:tcPr>
-            <w:tcW w:type="dxa" w:w="2016"/>
+            <w:tcW w:type="dxa" w:w="2448"/>
             <w:shd w:val="clear" w:fill="F3F7F3"/>
           </w:tcPr>
           <w:p>
@@ -9914,13 +10137,13 @@
               <w:rPr>
                 <w:sz w:val="17"/>
               </w:rPr>
-              <w:t>/dev/shm/sentinel</w:t>
-            </w:r>
-          </w:p>
-        </w:tc>
-        <w:tc>
-          <w:tcPr>
-            <w:tcW w:type="dxa" w:w="4752"/>
+              <w:t>storage/img/&lt;cam&gt;/  (Tier B)</w:t>
+            </w:r>
+          </w:p>
+        </w:tc>
+        <w:tc>
+          <w:tcPr>
+            <w:tcW w:type="dxa" w:w="4320"/>
             <w:shd w:val="clear" w:fill="F3F7F3"/>
           </w:tcPr>
           <w:p>
@@ -9933,13 +10156,13 @@
               <w:rPr>
                 <w:sz w:val="17"/>
               </w:rPr>
-              <w:t>&lt;cam&gt;.jpg preview, &lt;cam&gt;.tracks.json, metrics.json</w:t>
-            </w:r>
-          </w:p>
-        </w:tc>
-        <w:tc>
-          <w:tcPr>
-            <w:tcW w:type="dxa" w:w="2736"/>
+              <w:t>per-sighting evidence triple &lt;stem&gt;.jpg / _face.jpg / _full.jpg</w:t>
+            </w:r>
+          </w:p>
+        </w:tc>
+        <w:tc>
+          <w:tcPr>
+            <w:tcW w:type="dxa" w:w="2880"/>
             <w:shd w:val="clear" w:fill="F3F7F3"/>
           </w:tcPr>
           <w:p>
@@ -9952,7 +10175,7 @@
               <w:rPr>
                 <w:sz w:val="17"/>
               </w:rPr>
-              <w:t>overwritten live</w:t>
+              <w:t>media pruned &gt; MEDIA_RETENTION_DAYS (30) or STORAGE_MAX_GB (50) backstop, importance-aware</w:t>
             </w:r>
           </w:p>
         </w:tc>
@@ -9960,55 +10183,55 @@
       <w:tr>
         <w:tc>
           <w:tcPr>
-            <w:tcW w:type="dxa" w:w="2016"/>
-          </w:tcPr>
-          <w:p>
-            <w:r>
-              <w:rPr>
-                <w:sz w:val="17"/>
-              </w:rPr>
-            </w:r>
-            <w:r>
-              <w:rPr>
-                <w:sz w:val="17"/>
-              </w:rPr>
-              <w:t>storage/img/&lt;cam&gt;/</w:t>
-            </w:r>
-          </w:p>
-        </w:tc>
-        <w:tc>
-          <w:tcPr>
-            <w:tcW w:type="dxa" w:w="4752"/>
-          </w:tcPr>
-          <w:p>
-            <w:r>
-              <w:rPr>
-                <w:sz w:val="17"/>
-              </w:rPr>
-            </w:r>
-            <w:r>
-              <w:rPr>
-                <w:sz w:val="17"/>
-              </w:rPr>
-              <w:t>evidence triple &lt;stem&gt;.jpg / _face.jpg / _full.jpg</w:t>
-            </w:r>
-          </w:p>
-        </w:tc>
-        <w:tc>
-          <w:tcPr>
-            <w:tcW w:type="dxa" w:w="2736"/>
-          </w:tcPr>
-          <w:p>
-            <w:r>
-              <w:rPr>
-                <w:sz w:val="17"/>
-              </w:rPr>
-            </w:r>
-            <w:r>
-              <w:rPr>
-                <w:sz w:val="17"/>
-              </w:rPr>
-              <w:t>pruned (7 days / 5 GB)</w:t>
+            <w:tcW w:type="dxa" w:w="2448"/>
+          </w:tcPr>
+          <w:p>
+            <w:r>
+              <w:rPr>
+                <w:sz w:val="17"/>
+              </w:rPr>
+            </w:r>
+            <w:r>
+              <w:rPr>
+                <w:sz w:val="17"/>
+              </w:rPr>
+              <w:t>Redis</w:t>
+            </w:r>
+          </w:p>
+        </w:tc>
+        <w:tc>
+          <w:tcPr>
+            <w:tcW w:type="dxa" w:w="4320"/>
+          </w:tcPr>
+          <w:p>
+            <w:r>
+              <w:rPr>
+                <w:sz w:val="17"/>
+              </w:rPr>
+            </w:r>
+            <w:r>
+              <w:rPr>
+                <w:sz w:val="17"/>
+              </w:rPr>
+              <w:t>presence:current:{id} (TTL 300s); trackid:{detection_id} (TTL 900s); dedup:* (TTL 30s)</w:t>
+            </w:r>
+          </w:p>
+        </w:tc>
+        <w:tc>
+          <w:tcPr>
+            <w:tcW w:type="dxa" w:w="2880"/>
+          </w:tcPr>
+          <w:p>
+            <w:r>
+              <w:rPr>
+                <w:sz w:val="17"/>
+              </w:rPr>
+            </w:r>
+            <w:r>
+              <w:rPr>
+                <w:sz w:val="17"/>
+              </w:rPr>
+              <w:t>ephemeral</w:t>
             </w:r>
           </w:p>
         </w:tc>
@@ -10016,7 +10239,7 @@
       <w:tr>
         <w:tc>
           <w:tcPr>
-            <w:tcW w:type="dxa" w:w="2016"/>
+            <w:tcW w:type="dxa" w:w="2448"/>
             <w:shd w:val="clear" w:fill="F3F7F3"/>
           </w:tcPr>
           <w:p>
@@ -10029,13 +10252,13 @@
               <w:rPr>
                 <w:sz w:val="17"/>
               </w:rPr>
-              <w:t>storage/logs · datasheet</w:t>
-            </w:r>
-          </w:p>
-        </w:tc>
-        <w:tc>
-          <w:tcPr>
-            <w:tcW w:type="dxa" w:w="4752"/>
+              <w:t>/dev/shm/sentinel</w:t>
+            </w:r>
+          </w:p>
+        </w:tc>
+        <w:tc>
+          <w:tcPr>
+            <w:tcW w:type="dxa" w:w="4320"/>
             <w:shd w:val="clear" w:fill="F3F7F3"/>
           </w:tcPr>
           <w:p>
@@ -10048,13 +10271,13 @@
               <w:rPr>
                 <w:sz w:val="17"/>
               </w:rPr>
-              <w:t>archived events JSONL + person JSON</w:t>
-            </w:r>
-          </w:p>
-        </w:tc>
-        <w:tc>
-          <w:tcPr>
-            <w:tcW w:type="dxa" w:w="2736"/>
+              <w:t>&lt;cam&gt;.jpg preview, &lt;cam&gt;.tracks.json, metrics.json</w:t>
+            </w:r>
+          </w:p>
+        </w:tc>
+        <w:tc>
+          <w:tcPr>
+            <w:tcW w:type="dxa" w:w="2880"/>
             <w:shd w:val="clear" w:fill="F3F7F3"/>
           </w:tcPr>
           <w:p>
@@ -10067,259 +10290,7 @@
               <w:rPr>
                 <w:sz w:val="17"/>
               </w:rPr>
-              <w:t>append-only export</w:t>
-            </w:r>
-          </w:p>
-        </w:tc>
-      </w:tr>
-    </w:tbl>
-    <w:p>
-      <w:pPr>
-        <w:spacing w:after="40"/>
-      </w:pPr>
-    </w:p>
-    <w:p>
-      <w:pPr>
-        <w:pStyle w:val="Heading1"/>
-      </w:pPr>
-      <w:r>
-        <w:t>18. Orchestration &amp; Run Scripts</w:t>
-      </w:r>
-    </w:p>
-    <w:p>
-      <w:r>
-        <w:rPr>
-          <w:b/>
-        </w:rPr>
-        <w:t>run.sh</w:t>
-      </w:r>
-      <w:r>
-        <w:t xml:space="preserve"> (native GPU box) manages 5 processes via </w:t>
-      </w:r>
-      <w:r>
-        <w:rPr>
-          <w:rFonts w:ascii="Consolas" w:hAnsi="Consolas"/>
-          <w:color w:val="A03030"/>
-          <w:sz w:val="19"/>
-        </w:rPr>
-        <w:t>runtime/pids</w:t>
-      </w:r>
-      <w:r>
-        <w:t xml:space="preserve"> + </w:t>
-      </w:r>
-      <w:r>
-        <w:rPr>
-          <w:rFonts w:ascii="Consolas" w:hAnsi="Consolas"/>
-          <w:color w:val="A03030"/>
-          <w:sz w:val="19"/>
-        </w:rPr>
-        <w:t>runtime/logs</w:t>
-      </w:r>
-      <w:r>
-        <w:t xml:space="preserve"> (start|stop|restart|status|logs): </w:t>
-      </w:r>
-      <w:r>
-        <w:rPr>
-          <w:b/>
-        </w:rPr>
-        <w:t>brain</w:t>
-      </w:r>
-      <w:r>
-        <w:t xml:space="preserve"> (uvicorn :8000, waits for /health) → </w:t>
-      </w:r>
-      <w:r>
-        <w:rPr>
-          <w:b/>
-        </w:rPr>
-        <w:t>ui</w:t>
-      </w:r>
-      <w:r>
-        <w:t xml:space="preserve"> (server.py :8080) → </w:t>
-      </w:r>
-      <w:r>
-        <w:rPr>
-          <w:b/>
-        </w:rPr>
-        <w:t>pipeline</w:t>
-      </w:r>
-      <w:r>
-        <w:t xml:space="preserve"> (HF-offline + all tuning env) → </w:t>
-      </w:r>
-      <w:r>
-        <w:rPr>
-          <w:b/>
-        </w:rPr>
-        <w:t>prune</w:t>
-      </w:r>
-      <w:r>
-        <w:t xml:space="preserve"> (image retention) → </w:t>
-      </w:r>
-      <w:r>
-        <w:rPr>
-          <w:b/>
-        </w:rPr>
-        <w:t>dbprune</w:t>
-      </w:r>
-      <w:r>
-        <w:t xml:space="preserve"> (Postgres retention). Postgres+Redis must be up (systemd); Qdrant is embedded. </w:t>
-      </w:r>
-      <w:r>
-        <w:rPr>
-          <w:b/>
-        </w:rPr>
-        <w:t>run_all.sh</w:t>
-      </w:r>
-      <w:r>
-        <w:t xml:space="preserve"> brings up the Brain (Docker or native), the UI, and the </w:t>
-      </w:r>
-      <w:r>
-        <w:rPr>
-          <w:b/>
-        </w:rPr>
-        <w:t>simulated</w:t>
-      </w:r>
-      <w:r>
-        <w:t xml:space="preserve"> Part 1 for integration testing.</w:t>
-      </w:r>
-    </w:p>
-    <w:p>
-      <w:r>
-        <w:br w:type="page"/>
-      </w:r>
-    </w:p>
-    <w:p>
-      <w:pPr>
-        <w:pStyle w:val="Heading1"/>
-      </w:pPr>
-      <w:r>
-        <w:t>19. Code Organization &amp; the 2026-07 Modularization</w:t>
-      </w:r>
-    </w:p>
-    <w:p>
-      <w:r>
-        <w:t xml:space="preserve">The largest files were split for readability with </w:t>
-      </w:r>
-      <w:r>
-        <w:rPr>
-          <w:b/>
-        </w:rPr>
-        <w:t>zero behaviour change</w:t>
-      </w:r>
-      <w:r>
-        <w:t xml:space="preserve"> (verified: identical test results vs baseline, byte-identical content, live pipeline runs). Three mechanisms make the splits transparent:</w:t>
-      </w:r>
-    </w:p>
-    <w:p>
-      <w:pPr>
-        <w:pStyle w:val="Heading2"/>
-      </w:pPr>
-      <w:r>
-        <w:t>19.1 Python — re-exporting packages</w:t>
-      </w:r>
-    </w:p>
-    <w:p>
-      <w:r>
-        <w:t xml:space="preserve">A file </w:t>
-      </w:r>
-      <w:r>
-        <w:rPr>
-          <w:rFonts w:ascii="Consolas" w:hAnsi="Consolas"/>
-          <w:color w:val="A03030"/>
-          <w:sz w:val="19"/>
-        </w:rPr>
-        <w:t>X.py</w:t>
-      </w:r>
-      <w:r>
-        <w:t xml:space="preserve"> became a folder </w:t>
-      </w:r>
-      <w:r>
-        <w:rPr>
-          <w:rFonts w:ascii="Consolas" w:hAnsi="Consolas"/>
-          <w:color w:val="A03030"/>
-          <w:sz w:val="19"/>
-        </w:rPr>
-        <w:t>X/</w:t>
-      </w:r>
-      <w:r>
-        <w:t xml:space="preserve"> whose </w:t>
-      </w:r>
-      <w:r>
-        <w:rPr>
-          <w:rFonts w:ascii="Consolas" w:hAnsi="Consolas"/>
-          <w:color w:val="A03030"/>
-          <w:sz w:val="19"/>
-        </w:rPr>
-        <w:t>__init__.py</w:t>
-      </w:r>
-      <w:r>
-        <w:t xml:space="preserve"> re-exports every public name, so </w:t>
-      </w:r>
-      <w:r>
-        <w:rPr>
-          <w:rFonts w:ascii="Consolas" w:hAnsi="Consolas"/>
-          <w:color w:val="A03030"/>
-          <w:sz w:val="19"/>
-        </w:rPr>
-        <w:t>from … import X</w:t>
-      </w:r>
-      <w:r>
-        <w:t xml:space="preserve"> and </w:t>
-      </w:r>
-      <w:r>
-        <w:rPr>
-          <w:rFonts w:ascii="Consolas" w:hAnsi="Consolas"/>
-          <w:color w:val="A03030"/>
-          <w:sz w:val="19"/>
-        </w:rPr>
-        <w:t>X.attr</w:t>
-      </w:r>
-      <w:r>
-        <w:t xml:space="preserve"> are unchanged. Importing the package registers everything (needed for Alembic and SQLAlchemy string-relationship resolution).</w:t>
-      </w:r>
-    </w:p>
-    <w:tbl>
-      <w:tblPr>
-        <w:tblStyle w:val="TableGrid"/>
-        <w:tblW w:type="auto" w:w="0"/>
-        <w:jc w:val="left"/>
-        <w:tblLook w:firstColumn="1" w:firstRow="1" w:lastColumn="0" w:lastRow="0" w:noHBand="0" w:noVBand="1" w:val="04A0"/>
-      </w:tblPr>
-      <w:tblGrid>
-        <w:gridCol w:w="4896"/>
-        <w:gridCol w:w="4896"/>
-      </w:tblGrid>
-      <w:tr>
-        <w:tc>
-          <w:tcPr>
-            <w:tcW w:type="dxa" w:w="3456"/>
-            <w:shd w:val="clear" w:fill="2E7D32"/>
-          </w:tcPr>
-          <w:p>
-            <w:r/>
-            <w:r>
-              <w:rPr>
-                <w:b/>
-                <w:color w:val="FFFFFF"/>
-                <w:sz w:val="18"/>
-              </w:rPr>
-              <w:t>Was</w:t>
-            </w:r>
-          </w:p>
-        </w:tc>
-        <w:tc>
-          <w:tcPr>
-            <w:tcW w:type="dxa" w:w="5760"/>
-            <w:shd w:val="clear" w:fill="2E7D32"/>
-          </w:tcPr>
-          <w:p>
-            <w:r/>
-            <w:r>
-              <w:rPr>
-                <w:b/>
-                <w:color w:val="FFFFFF"/>
-                <w:sz w:val="18"/>
-              </w:rPr>
-              <w:t>Now (package)</w:t>
+              <w:t>overwritten live</w:t>
             </w:r>
           </w:p>
         </w:tc>
@@ -10327,492 +10298,55 @@
       <w:tr>
         <w:tc>
           <w:tcPr>
-            <w:tcW w:type="dxa" w:w="3456"/>
-          </w:tcPr>
-          <w:p>
-            <w:r>
-              <w:rPr>
-                <w:sz w:val="17"/>
-              </w:rPr>
-            </w:r>
-            <w:r>
-              <w:rPr>
-                <w:sz w:val="17"/>
-              </w:rPr>
-              <w:t>db/models.py (349)</w:t>
-            </w:r>
-          </w:p>
-        </w:tc>
-        <w:tc>
-          <w:tcPr>
-            <w:tcW w:type="dxa" w:w="5760"/>
-          </w:tcPr>
-          <w:p>
-            <w:r>
-              <w:rPr>
-                <w:sz w:val="17"/>
-              </w:rPr>
-            </w:r>
-            <w:r>
-              <w:rPr>
-                <w:sz w:val="17"/>
-              </w:rPr>
-              <w:t>db/models/ — enums, identity, employee, visitor, camera, session, detection_event, unknown_case</w:t>
-            </w:r>
-          </w:p>
-        </w:tc>
-      </w:tr>
-      <w:tr>
-        <w:tc>
-          <w:tcPr>
-            <w:tcW w:type="dxa" w:w="3456"/>
-            <w:shd w:val="clear" w:fill="F3F7F3"/>
-          </w:tcPr>
-          <w:p>
-            <w:r>
-              <w:rPr>
-                <w:sz w:val="17"/>
-              </w:rPr>
-            </w:r>
-            <w:r>
-              <w:rPr>
-                <w:sz w:val="17"/>
-              </w:rPr>
-              <w:t>config.py (323)</w:t>
-            </w:r>
-          </w:p>
-        </w:tc>
-        <w:tc>
-          <w:tcPr>
-            <w:tcW w:type="dxa" w:w="5760"/>
-            <w:shd w:val="clear" w:fill="F3F7F3"/>
-          </w:tcPr>
-          <w:p>
-            <w:r>
-              <w:rPr>
-                <w:sz w:val="17"/>
-              </w:rPr>
-            </w:r>
-            <w:r>
-              <w:rPr>
-                <w:sz w:val="17"/>
-              </w:rPr>
-              <w:t>config/ — per-section pydantic mixins (postgres/qdrant/redis/matching/storage/admin) + settings + __init__</w:t>
-            </w:r>
-          </w:p>
-        </w:tc>
-      </w:tr>
-      <w:tr>
-        <w:tc>
-          <w:tcPr>
-            <w:tcW w:type="dxa" w:w="3456"/>
-          </w:tcPr>
-          <w:p>
-            <w:r>
-              <w:rPr>
-                <w:sz w:val="17"/>
-              </w:rPr>
-            </w:r>
-            <w:r>
-              <w:rPr>
-                <w:sz w:val="17"/>
-              </w:rPr>
-              <w:t>repositories/identity_repo.py (361)</w:t>
-            </w:r>
-          </w:p>
-        </w:tc>
-        <w:tc>
-          <w:tcPr>
-            <w:tcW w:type="dxa" w:w="5760"/>
-          </w:tcPr>
-          <w:p>
-            <w:r>
-              <w:rPr>
-                <w:sz w:val="17"/>
-              </w:rPr>
-            </w:r>
-            <w:r>
-              <w:rPr>
-                <w:sz w:val="17"/>
-              </w:rPr>
-              <w:t>identity_repo/ — identities, visitors, employees, lookups, unknown_cases, search, labels</w:t>
-            </w:r>
-          </w:p>
-        </w:tc>
-      </w:tr>
-      <w:tr>
-        <w:tc>
-          <w:tcPr>
-            <w:tcW w:type="dxa" w:w="3456"/>
-            <w:shd w:val="clear" w:fill="F3F7F3"/>
-          </w:tcPr>
-          <w:p>
-            <w:r>
-              <w:rPr>
-                <w:sz w:val="17"/>
-              </w:rPr>
-            </w:r>
-            <w:r>
-              <w:rPr>
-                <w:sz w:val="17"/>
-              </w:rPr>
-              <w:t>services/identity_resolver.py (389)</w:t>
-            </w:r>
-          </w:p>
-        </w:tc>
-        <w:tc>
-          <w:tcPr>
-            <w:tcW w:type="dxa" w:w="5760"/>
-            <w:shd w:val="clear" w:fill="F3F7F3"/>
-          </w:tcPr>
-          <w:p>
-            <w:r>
-              <w:rPr>
-                <w:sz w:val="17"/>
-              </w:rPr>
-            </w:r>
-            <w:r>
-              <w:rPr>
-                <w:sz w:val="17"/>
-              </w:rPr>
-              <w:t>identity_resolver/ — types, track_sticky, helpers, body_relink, visitor_create, resolve</w:t>
-            </w:r>
-          </w:p>
-        </w:tc>
-      </w:tr>
-    </w:tbl>
-    <w:p>
-      <w:pPr>
-        <w:spacing w:after="40"/>
-      </w:pPr>
-    </w:p>
-    <w:p>
-      <w:pPr>
-        <w:pStyle w:val="Heading2"/>
-      </w:pPr>
-      <w:r>
-        <w:t>19.2 UI — ordered &lt;script&gt; / &lt;link&gt;</w:t>
-      </w:r>
-    </w:p>
-    <w:p>
-      <w:r>
-        <w:t xml:space="preserve">The UI has no bundler; every function is a global loaded via a </w:t>
-      </w:r>
-      <w:r>
-        <w:rPr>
-          <w:rFonts w:ascii="Consolas" w:hAnsi="Consolas"/>
-          <w:color w:val="A03030"/>
-          <w:sz w:val="19"/>
-        </w:rPr>
-        <w:t>&lt;script&gt;</w:t>
-      </w:r>
-      <w:r>
-        <w:t xml:space="preserve"> tag, so the files can be cut and listed in the same order. </w:t>
-      </w:r>
-      <w:r>
-        <w:rPr>
-          <w:rFonts w:ascii="Consolas" w:hAnsi="Consolas"/>
-          <w:color w:val="A03030"/>
-          <w:sz w:val="19"/>
-        </w:rPr>
-        <w:t>app.js</w:t>
-      </w:r>
-      <w:r>
-        <w:t xml:space="preserve"> (1659) → </w:t>
-      </w:r>
-      <w:r>
-        <w:rPr>
-          <w:rFonts w:ascii="Consolas" w:hAnsi="Consolas"/>
-          <w:color w:val="A03030"/>
-          <w:sz w:val="19"/>
-        </w:rPr>
-        <w:t>app-core / -grid / -person / -admin / -track / -log / -report / -boot.js</w:t>
-      </w:r>
-      <w:r>
-        <w:t xml:space="preserve">. </w:t>
-      </w:r>
-      <w:r>
-        <w:rPr>
-          <w:rFonts w:ascii="Consolas" w:hAnsi="Consolas"/>
-          <w:color w:val="A03030"/>
-          <w:sz w:val="19"/>
-        </w:rPr>
-        <w:t>styles.css</w:t>
-      </w:r>
-      <w:r>
-        <w:t xml:space="preserve"> (1486) → 9 </w:t>
-      </w:r>
-      <w:r>
-        <w:rPr>
-          <w:rFonts w:ascii="Consolas" w:hAnsi="Consolas"/>
-          <w:color w:val="A03030"/>
-          <w:sz w:val="19"/>
-        </w:rPr>
-        <w:t>styles/*.css</w:t>
-      </w:r>
-      <w:r>
-        <w:t xml:space="preserve"> linked in cascade order.</w:t>
-      </w:r>
-    </w:p>
-    <w:tbl>
-      <w:tblPr>
-        <w:tblStyle w:val="TableGrid"/>
-        <w:tblW w:type="auto" w:w="0"/>
-        <w:tblLook w:firstColumn="1" w:firstRow="1" w:lastColumn="0" w:lastRow="0" w:noHBand="0" w:noVBand="1" w:val="04A0"/>
-      </w:tblPr>
-      <w:tblGrid>
-        <w:gridCol w:w="9792"/>
-      </w:tblGrid>
-      <w:tr>
-        <w:tc>
-          <w:tcPr>
-            <w:tcW w:type="dxa" w:w="9792"/>
-            <w:shd w:val="clear" w:fill="FDECEA"/>
-          </w:tcPr>
-          <w:p>
-            <w:pPr>
-              <w:spacing w:after="40" w:before="20"/>
-            </w:pPr>
-            <w:r>
-              <w:rPr>
-                <w:b/>
-                <w:color w:val="B00020"/>
-                <w:sz w:val="18"/>
-              </w:rPr>
-              <w:t>GOTCHA</w:t>
-            </w:r>
-          </w:p>
-          <w:p>
-            <w:pPr>
-              <w:spacing w:after="0" w:before="20"/>
-            </w:pPr>
-            <w:r>
-              <w:rPr>
-                <w:rFonts w:ascii="Consolas" w:hAnsi="Consolas"/>
-                <w:b/>
-                <w:color w:val="A03030"/>
-                <w:sz w:val="19"/>
-              </w:rPr>
-              <w:t>app-boot.js</w:t>
-            </w:r>
-            <w:r>
-              <w:rPr>
-                <w:b/>
-              </w:rPr>
-              <w:t xml:space="preserve"> MUST load last.</w:t>
-            </w:r>
-            <w:r>
-              <w:t xml:space="preserve"> It holds the top-level wiring (</w:t>
-            </w:r>
-            <w:r>
-              <w:rPr>
-                <w:rFonts w:ascii="Consolas" w:hAnsi="Consolas"/>
-                <w:color w:val="A03030"/>
-                <w:sz w:val="19"/>
-              </w:rPr>
-              <w:t>setInterval(pollFeeds…)</w:t>
-            </w:r>
-            <w:r>
-              <w:t>, the clock, fullscreen listeners, the background IIFE) that relied on function hoisting within the single file — splitting broke hoisting across files, so those statements moved to boot. Any NEW top-level side-effect statement belongs in app-boot.js, not a feature file.</w:t>
-            </w:r>
-          </w:p>
-        </w:tc>
-      </w:tr>
-    </w:tbl>
-    <w:p>
-      <w:pPr>
-        <w:spacing w:after="40"/>
-      </w:pPr>
-    </w:p>
-    <w:p>
-      <w:pPr>
-        <w:pStyle w:val="Heading2"/>
-      </w:pPr>
-      <w:r>
-        <w:t>19.3 pipeline.py — sibling helper modules</w:t>
-      </w:r>
-    </w:p>
-    <w:p>
-      <w:r>
-        <w:t xml:space="preserve">The stateless helpers were extracted to flat siblings and imported back (688 → 508 lines): </w:t>
-      </w:r>
-      <w:r>
-        <w:rPr>
-          <w:rFonts w:ascii="Consolas" w:hAnsi="Consolas"/>
-          <w:color w:val="A03030"/>
-          <w:sz w:val="19"/>
-        </w:rPr>
-        <w:t>ppl_colors.py</w:t>
-      </w:r>
-      <w:r>
-        <w:t xml:space="preserve"> (shared box colours), </w:t>
-      </w:r>
-      <w:r>
-        <w:rPr>
-          <w:rFonts w:ascii="Consolas" w:hAnsi="Consolas"/>
-          <w:color w:val="A03030"/>
-          <w:sz w:val="19"/>
-        </w:rPr>
-        <w:t>geometry.py</w:t>
-      </w:r>
-      <w:r>
-        <w:t xml:space="preserve"> (IoU/overlap/occlusion/label), </w:t>
-      </w:r>
-      <w:r>
-        <w:rPr>
-          <w:rFonts w:ascii="Consolas" w:hAnsi="Consolas"/>
-          <w:color w:val="A03030"/>
-          <w:sz w:val="19"/>
-        </w:rPr>
-        <w:t>snapshots.py</w:t>
-      </w:r>
-      <w:r>
-        <w:t xml:space="preserve"> (crop/sharpness/pooling + save_* + storage constants), </w:t>
-      </w:r>
-      <w:r>
-        <w:rPr>
-          <w:rFonts w:ascii="Consolas" w:hAnsi="Consolas"/>
-          <w:color w:val="A03030"/>
-          <w:sz w:val="19"/>
-        </w:rPr>
-        <w:t>payload.py</w:t>
-      </w:r>
-      <w:r>
-        <w:t xml:space="preserve"> (timestamp / Brain-label mapping / payload builder + </w:t>
-      </w:r>
-      <w:r>
-        <w:rPr>
-          <w:rFonts w:ascii="Consolas" w:hAnsi="Consolas"/>
-          <w:color w:val="A03030"/>
-          <w:sz w:val="19"/>
-        </w:rPr>
-        <w:t>_RUN_EPOCH</w:t>
-      </w:r>
-      <w:r>
-        <w:t xml:space="preserve">). The threads, module globals and </w:t>
-      </w:r>
-      <w:r>
-        <w:rPr>
-          <w:rFonts w:ascii="Consolas" w:hAnsi="Consolas"/>
-          <w:color w:val="A03030"/>
-          <w:sz w:val="19"/>
-        </w:rPr>
-        <w:t>main()</w:t>
-      </w:r>
-      <w:r>
-        <w:t xml:space="preserve"> stayed in pipeline.py by design (they own the shared perception state).</w:t>
-      </w:r>
-    </w:p>
-    <w:p>
-      <w:pPr>
-        <w:pBdr>
-          <w:bottom w:val="single" w:sz="6" w:space="1" w:color="2E7D32"/>
-        </w:pBdr>
-      </w:pPr>
-    </w:p>
-    <w:p>
-      <w:pPr>
-        <w:pStyle w:val="Heading1"/>
-      </w:pPr>
-      <w:r>
-        <w:t>20. Recent Changes Log (2026-07-15 / 16)</w:t>
-      </w:r>
-    </w:p>
-    <w:tbl>
-      <w:tblPr>
-        <w:tblStyle w:val="TableGrid"/>
-        <w:tblW w:type="auto" w:w="0"/>
-        <w:tblLook w:firstColumn="1" w:firstRow="1" w:lastColumn="0" w:lastRow="0" w:noHBand="0" w:noVBand="1" w:val="04A0"/>
-      </w:tblPr>
-      <w:tblGrid>
-        <w:gridCol w:w="9792"/>
-      </w:tblGrid>
-      <w:tr>
-        <w:tc>
-          <w:tcPr>
-            <w:tcW w:type="dxa" w:w="9792"/>
-            <w:shd w:val="clear" w:fill="E6F4EA"/>
-          </w:tcPr>
-          <w:p>
-            <w:pPr>
-              <w:spacing w:after="40" w:before="20"/>
-            </w:pPr>
-            <w:r>
-              <w:rPr>
-                <w:b/>
-                <w:color w:val="2E7D32"/>
-                <w:sz w:val="18"/>
-              </w:rPr>
-              <w:t>FIXED</w:t>
-            </w:r>
-          </w:p>
-          <w:p>
-            <w:pPr>
-              <w:spacing w:after="0" w:before="20"/>
-            </w:pPr>
-            <w:r>
-              <w:rPr>
-                <w:b/>
-              </w:rPr>
-              <w:t>Unknown visitors weren't logging.</w:t>
-            </w:r>
-            <w:r>
-              <w:t xml:space="preserve"> The </w:t>
-            </w:r>
-            <w:r>
-              <w:rPr>
-                <w:rFonts w:ascii="Consolas" w:hAnsi="Consolas"/>
-                <w:color w:val="A03030"/>
-                <w:sz w:val="19"/>
-              </w:rPr>
-              <w:t>f8779ae</w:t>
-            </w:r>
-            <w:r>
-              <w:t xml:space="preserve"> refactor dropped the </w:t>
-            </w:r>
-            <w:r>
-              <w:rPr>
-                <w:rFonts w:ascii="Consolas" w:hAnsi="Consolas"/>
-                <w:color w:val="A03030"/>
-                <w:sz w:val="19"/>
-              </w:rPr>
-              <w:t>DetectionEvent</w:t>
-            </w:r>
-            <w:r>
-              <w:t xml:space="preserve"> evidence columns + </w:t>
-            </w:r>
-            <w:r>
-              <w:rPr>
-                <w:rFonts w:ascii="Consolas" w:hAnsi="Consolas"/>
-                <w:color w:val="A03030"/>
-                <w:sz w:val="19"/>
-              </w:rPr>
-              <w:t>UnknownCase</w:t>
-            </w:r>
-            <w:r>
-              <w:t xml:space="preserve"> from the ORM but left </w:t>
-            </w:r>
-            <w:r>
-              <w:rPr>
-                <w:rFonts w:ascii="Consolas" w:hAnsi="Consolas"/>
-                <w:color w:val="A03030"/>
-                <w:sz w:val="19"/>
-              </w:rPr>
-              <w:t>event_repo</w:t>
-            </w:r>
-            <w:r>
-              <w:t xml:space="preserve"> writing them → every </w:t>
-            </w:r>
-            <w:r>
-              <w:rPr>
-                <w:rFonts w:ascii="Consolas" w:hAnsi="Consolas"/>
-                <w:color w:val="A03030"/>
-                <w:sz w:val="19"/>
-              </w:rPr>
-              <w:t>POST /events</w:t>
-            </w:r>
-            <w:r>
-              <w:t xml:space="preserve"> returned 500; the pipeline masked it as an on-frame “Unknown”. Restored the ORM columns + model to match the live DB (no migration needed). Verified: a body-only Unknown now logs.</w:t>
+            <w:tcW w:type="dxa" w:w="2448"/>
+          </w:tcPr>
+          <w:p>
+            <w:r>
+              <w:rPr>
+                <w:sz w:val="17"/>
+              </w:rPr>
+            </w:r>
+            <w:r>
+              <w:rPr>
+                <w:sz w:val="17"/>
+              </w:rPr>
+              <w:t>storage/logs · datasheet</w:t>
+            </w:r>
+          </w:p>
+        </w:tc>
+        <w:tc>
+          <w:tcPr>
+            <w:tcW w:type="dxa" w:w="4320"/>
+          </w:tcPr>
+          <w:p>
+            <w:r>
+              <w:rPr>
+                <w:sz w:val="17"/>
+              </w:rPr>
+            </w:r>
+            <w:r>
+              <w:rPr>
+                <w:sz w:val="17"/>
+              </w:rPr>
+              <w:t>archived events JSONL + person JSON</w:t>
+            </w:r>
+          </w:p>
+        </w:tc>
+        <w:tc>
+          <w:tcPr>
+            <w:tcW w:type="dxa" w:w="2880"/>
+          </w:tcPr>
+          <w:p>
+            <w:r>
+              <w:rPr>
+                <w:sz w:val="17"/>
+              </w:rPr>
+            </w:r>
+            <w:r>
+              <w:rPr>
+                <w:sz w:val="17"/>
+              </w:rPr>
+              <w:t>append-only export (OFF in native mode — see §21)</w:t>
             </w:r>
           </w:p>
         </w:tc>
@@ -10836,7 +10370,7 @@
         <w:tc>
           <w:tcPr>
             <w:tcW w:type="dxa" w:w="9792"/>
-            <w:shd w:val="clear" w:fill="E6F4EA"/>
+            <w:shd w:val="clear" w:fill="EEEEEE"/>
           </w:tcPr>
           <w:p>
             <w:pPr>
@@ -10845,10 +10379,10 @@
             <w:r>
               <w:rPr>
                 <w:b/>
-                <w:color w:val="2E7D32"/>
+                <w:color w:val="555555"/>
                 <w:sz w:val="18"/>
               </w:rPr>
-              <w:t>FIXED</w:t>
+              <w:t>HOW IT WORKS</w:t>
             </w:r>
           </w:p>
           <w:p>
@@ -10859,10 +10393,545 @@
               <w:rPr>
                 <w:b/>
               </w:rPr>
-              <w:t>Photos not showing in the log.</w:t>
-            </w:r>
-            <w:r>
-              <w:t xml:space="preserve"> </w:t>
+              <w:t>Why this bounds storage without losing data.</w:t>
+            </w:r>
+            <w:r>
+              <w:t xml:space="preserve"> The durable tier (records + one ~20 KB photo per identity) grows only with the number of *distinct people* — a few GB forever. The unbounded thing is per-sighting frames (Tier B), which are capped by an age window + size backstop. So old *bulk frames* age out gracefully, but the sighting rows and every person's face survive. Losing a person entirely now requires an explicit purge.</w:t>
+            </w:r>
+          </w:p>
+        </w:tc>
+      </w:tr>
+    </w:tbl>
+    <w:p>
+      <w:pPr>
+        <w:spacing w:after="40"/>
+      </w:pPr>
+    </w:p>
+    <w:p>
+      <w:pPr>
+        <w:pStyle w:val="Heading1"/>
+      </w:pPr>
+      <w:r>
+        <w:t>18. Orchestration &amp; Run Scripts</w:t>
+      </w:r>
+    </w:p>
+    <w:p>
+      <w:r>
+        <w:rPr>
+          <w:b/>
+        </w:rPr>
+        <w:t>run.sh</w:t>
+      </w:r>
+      <w:r>
+        <w:t xml:space="preserve"> (native GPU box) manages 5 processes via </w:t>
+      </w:r>
+      <w:r>
+        <w:rPr>
+          <w:rFonts w:ascii="Consolas" w:hAnsi="Consolas"/>
+          <w:color w:val="A03030"/>
+          <w:sz w:val="19"/>
+        </w:rPr>
+        <w:t>runtime/pids</w:t>
+      </w:r>
+      <w:r>
+        <w:t xml:space="preserve"> + </w:t>
+      </w:r>
+      <w:r>
+        <w:rPr>
+          <w:rFonts w:ascii="Consolas" w:hAnsi="Consolas"/>
+          <w:color w:val="A03030"/>
+          <w:sz w:val="19"/>
+        </w:rPr>
+        <w:t>runtime/logs</w:t>
+      </w:r>
+      <w:r>
+        <w:t xml:space="preserve"> (start|stop|restart|status|logs): </w:t>
+      </w:r>
+      <w:r>
+        <w:rPr>
+          <w:b/>
+        </w:rPr>
+        <w:t>brain</w:t>
+      </w:r>
+      <w:r>
+        <w:t xml:space="preserve"> (uvicorn :8000, waits for /health) → </w:t>
+      </w:r>
+      <w:r>
+        <w:rPr>
+          <w:b/>
+        </w:rPr>
+        <w:t>ui</w:t>
+      </w:r>
+      <w:r>
+        <w:t xml:space="preserve"> (server.py :8080) → </w:t>
+      </w:r>
+      <w:r>
+        <w:rPr>
+          <w:b/>
+        </w:rPr>
+        <w:t>pipeline</w:t>
+      </w:r>
+      <w:r>
+        <w:t xml:space="preserve"> (HF-offline + all tuning env) → </w:t>
+      </w:r>
+      <w:r>
+        <w:rPr>
+          <w:b/>
+        </w:rPr>
+        <w:t>prune</w:t>
+      </w:r>
+      <w:r>
+        <w:t xml:space="preserve"> (image retention) → </w:t>
+      </w:r>
+      <w:r>
+        <w:rPr>
+          <w:b/>
+        </w:rPr>
+        <w:t>dbprune</w:t>
+      </w:r>
+      <w:r>
+        <w:t xml:space="preserve"> (Postgres retention). Postgres+Redis must be up (systemd); Qdrant is embedded. </w:t>
+      </w:r>
+      <w:r>
+        <w:rPr>
+          <w:b/>
+        </w:rPr>
+        <w:t>run_all.sh</w:t>
+      </w:r>
+      <w:r>
+        <w:t xml:space="preserve"> brings up the Brain (Docker or native), the UI, and the </w:t>
+      </w:r>
+      <w:r>
+        <w:rPr>
+          <w:b/>
+        </w:rPr>
+        <w:t>simulated</w:t>
+      </w:r>
+      <w:r>
+        <w:t xml:space="preserve"> Part 1 for integration testing.</w:t>
+      </w:r>
+    </w:p>
+    <w:p>
+      <w:r>
+        <w:br w:type="page"/>
+      </w:r>
+    </w:p>
+    <w:p>
+      <w:pPr>
+        <w:pStyle w:val="Heading1"/>
+      </w:pPr>
+      <w:r>
+        <w:t>19. Code Organization &amp; the 2026-07 Modularization</w:t>
+      </w:r>
+    </w:p>
+    <w:p>
+      <w:r>
+        <w:t xml:space="preserve">The largest files were split for readability with </w:t>
+      </w:r>
+      <w:r>
+        <w:rPr>
+          <w:b/>
+        </w:rPr>
+        <w:t>zero behaviour change</w:t>
+      </w:r>
+      <w:r>
+        <w:t xml:space="preserve"> (verified: identical test results vs baseline, byte-identical content, live pipeline runs). Three mechanisms make the splits transparent:</w:t>
+      </w:r>
+    </w:p>
+    <w:p>
+      <w:pPr>
+        <w:pStyle w:val="Heading2"/>
+      </w:pPr>
+      <w:r>
+        <w:t>19.1 Python — re-exporting packages</w:t>
+      </w:r>
+    </w:p>
+    <w:p>
+      <w:r>
+        <w:t xml:space="preserve">A file </w:t>
+      </w:r>
+      <w:r>
+        <w:rPr>
+          <w:rFonts w:ascii="Consolas" w:hAnsi="Consolas"/>
+          <w:color w:val="A03030"/>
+          <w:sz w:val="19"/>
+        </w:rPr>
+        <w:t>X.py</w:t>
+      </w:r>
+      <w:r>
+        <w:t xml:space="preserve"> became a folder </w:t>
+      </w:r>
+      <w:r>
+        <w:rPr>
+          <w:rFonts w:ascii="Consolas" w:hAnsi="Consolas"/>
+          <w:color w:val="A03030"/>
+          <w:sz w:val="19"/>
+        </w:rPr>
+        <w:t>X/</w:t>
+      </w:r>
+      <w:r>
+        <w:t xml:space="preserve"> whose </w:t>
+      </w:r>
+      <w:r>
+        <w:rPr>
+          <w:rFonts w:ascii="Consolas" w:hAnsi="Consolas"/>
+          <w:color w:val="A03030"/>
+          <w:sz w:val="19"/>
+        </w:rPr>
+        <w:t>__init__.py</w:t>
+      </w:r>
+      <w:r>
+        <w:t xml:space="preserve"> re-exports every public name, so </w:t>
+      </w:r>
+      <w:r>
+        <w:rPr>
+          <w:rFonts w:ascii="Consolas" w:hAnsi="Consolas"/>
+          <w:color w:val="A03030"/>
+          <w:sz w:val="19"/>
+        </w:rPr>
+        <w:t>from … import X</w:t>
+      </w:r>
+      <w:r>
+        <w:t xml:space="preserve"> and </w:t>
+      </w:r>
+      <w:r>
+        <w:rPr>
+          <w:rFonts w:ascii="Consolas" w:hAnsi="Consolas"/>
+          <w:color w:val="A03030"/>
+          <w:sz w:val="19"/>
+        </w:rPr>
+        <w:t>X.attr</w:t>
+      </w:r>
+      <w:r>
+        <w:t xml:space="preserve"> are unchanged. Importing the package registers everything (needed for Alembic and SQLAlchemy string-relationship resolution).</w:t>
+      </w:r>
+    </w:p>
+    <w:tbl>
+      <w:tblPr>
+        <w:tblStyle w:val="TableGrid"/>
+        <w:tblW w:type="auto" w:w="0"/>
+        <w:jc w:val="left"/>
+        <w:tblLook w:firstColumn="1" w:firstRow="1" w:lastColumn="0" w:lastRow="0" w:noHBand="0" w:noVBand="1" w:val="04A0"/>
+      </w:tblPr>
+      <w:tblGrid>
+        <w:gridCol w:w="4896"/>
+        <w:gridCol w:w="4896"/>
+      </w:tblGrid>
+      <w:tr>
+        <w:tc>
+          <w:tcPr>
+            <w:tcW w:type="dxa" w:w="3456"/>
+            <w:shd w:val="clear" w:fill="2E7D32"/>
+          </w:tcPr>
+          <w:p>
+            <w:r/>
+            <w:r>
+              <w:rPr>
+                <w:b/>
+                <w:color w:val="FFFFFF"/>
+                <w:sz w:val="18"/>
+              </w:rPr>
+              <w:t>Was</w:t>
+            </w:r>
+          </w:p>
+        </w:tc>
+        <w:tc>
+          <w:tcPr>
+            <w:tcW w:type="dxa" w:w="5760"/>
+            <w:shd w:val="clear" w:fill="2E7D32"/>
+          </w:tcPr>
+          <w:p>
+            <w:r/>
+            <w:r>
+              <w:rPr>
+                <w:b/>
+                <w:color w:val="FFFFFF"/>
+                <w:sz w:val="18"/>
+              </w:rPr>
+              <w:t>Now (package)</w:t>
+            </w:r>
+          </w:p>
+        </w:tc>
+      </w:tr>
+      <w:tr>
+        <w:tc>
+          <w:tcPr>
+            <w:tcW w:type="dxa" w:w="3456"/>
+          </w:tcPr>
+          <w:p>
+            <w:r>
+              <w:rPr>
+                <w:sz w:val="17"/>
+              </w:rPr>
+            </w:r>
+            <w:r>
+              <w:rPr>
+                <w:sz w:val="17"/>
+              </w:rPr>
+              <w:t>db/models.py (349)</w:t>
+            </w:r>
+          </w:p>
+        </w:tc>
+        <w:tc>
+          <w:tcPr>
+            <w:tcW w:type="dxa" w:w="5760"/>
+          </w:tcPr>
+          <w:p>
+            <w:r>
+              <w:rPr>
+                <w:sz w:val="17"/>
+              </w:rPr>
+            </w:r>
+            <w:r>
+              <w:rPr>
+                <w:sz w:val="17"/>
+              </w:rPr>
+              <w:t>db/models/ — enums, identity, employee, visitor, camera, session, detection_event, unknown_case</w:t>
+            </w:r>
+          </w:p>
+        </w:tc>
+      </w:tr>
+      <w:tr>
+        <w:tc>
+          <w:tcPr>
+            <w:tcW w:type="dxa" w:w="3456"/>
+            <w:shd w:val="clear" w:fill="F3F7F3"/>
+          </w:tcPr>
+          <w:p>
+            <w:r>
+              <w:rPr>
+                <w:sz w:val="17"/>
+              </w:rPr>
+            </w:r>
+            <w:r>
+              <w:rPr>
+                <w:sz w:val="17"/>
+              </w:rPr>
+              <w:t>config.py (323)</w:t>
+            </w:r>
+          </w:p>
+        </w:tc>
+        <w:tc>
+          <w:tcPr>
+            <w:tcW w:type="dxa" w:w="5760"/>
+            <w:shd w:val="clear" w:fill="F3F7F3"/>
+          </w:tcPr>
+          <w:p>
+            <w:r>
+              <w:rPr>
+                <w:sz w:val="17"/>
+              </w:rPr>
+            </w:r>
+            <w:r>
+              <w:rPr>
+                <w:sz w:val="17"/>
+              </w:rPr>
+              <w:t>config/ — per-section pydantic mixins (postgres/qdrant/redis/matching/storage/admin) + settings + __init__</w:t>
+            </w:r>
+          </w:p>
+        </w:tc>
+      </w:tr>
+      <w:tr>
+        <w:tc>
+          <w:tcPr>
+            <w:tcW w:type="dxa" w:w="3456"/>
+          </w:tcPr>
+          <w:p>
+            <w:r>
+              <w:rPr>
+                <w:sz w:val="17"/>
+              </w:rPr>
+            </w:r>
+            <w:r>
+              <w:rPr>
+                <w:sz w:val="17"/>
+              </w:rPr>
+              <w:t>repositories/identity_repo.py (361)</w:t>
+            </w:r>
+          </w:p>
+        </w:tc>
+        <w:tc>
+          <w:tcPr>
+            <w:tcW w:type="dxa" w:w="5760"/>
+          </w:tcPr>
+          <w:p>
+            <w:r>
+              <w:rPr>
+                <w:sz w:val="17"/>
+              </w:rPr>
+            </w:r>
+            <w:r>
+              <w:rPr>
+                <w:sz w:val="17"/>
+              </w:rPr>
+              <w:t>identity_repo/ — identities, visitors, employees, lookups, unknown_cases, search, labels</w:t>
+            </w:r>
+          </w:p>
+        </w:tc>
+      </w:tr>
+      <w:tr>
+        <w:tc>
+          <w:tcPr>
+            <w:tcW w:type="dxa" w:w="3456"/>
+            <w:shd w:val="clear" w:fill="F3F7F3"/>
+          </w:tcPr>
+          <w:p>
+            <w:r>
+              <w:rPr>
+                <w:sz w:val="17"/>
+              </w:rPr>
+            </w:r>
+            <w:r>
+              <w:rPr>
+                <w:sz w:val="17"/>
+              </w:rPr>
+              <w:t>services/identity_resolver.py (389)</w:t>
+            </w:r>
+          </w:p>
+        </w:tc>
+        <w:tc>
+          <w:tcPr>
+            <w:tcW w:type="dxa" w:w="5760"/>
+            <w:shd w:val="clear" w:fill="F3F7F3"/>
+          </w:tcPr>
+          <w:p>
+            <w:r>
+              <w:rPr>
+                <w:sz w:val="17"/>
+              </w:rPr>
+            </w:r>
+            <w:r>
+              <w:rPr>
+                <w:sz w:val="17"/>
+              </w:rPr>
+              <w:t>identity_resolver/ — types, track_sticky, helpers, body_relink, visitor_create, resolve</w:t>
+            </w:r>
+          </w:p>
+        </w:tc>
+      </w:tr>
+    </w:tbl>
+    <w:p>
+      <w:pPr>
+        <w:spacing w:after="40"/>
+      </w:pPr>
+    </w:p>
+    <w:p>
+      <w:pPr>
+        <w:pStyle w:val="Heading2"/>
+      </w:pPr>
+      <w:r>
+        <w:t>19.2 UI — ordered &lt;script&gt; / &lt;link&gt;</w:t>
+      </w:r>
+    </w:p>
+    <w:p>
+      <w:r>
+        <w:t xml:space="preserve">The UI has no bundler; every function is a global loaded via a </w:t>
+      </w:r>
+      <w:r>
+        <w:rPr>
+          <w:rFonts w:ascii="Consolas" w:hAnsi="Consolas"/>
+          <w:color w:val="A03030"/>
+          <w:sz w:val="19"/>
+        </w:rPr>
+        <w:t>&lt;script&gt;</w:t>
+      </w:r>
+      <w:r>
+        <w:t xml:space="preserve"> tag, so the files can be cut and listed in the same order. </w:t>
+      </w:r>
+      <w:r>
+        <w:rPr>
+          <w:rFonts w:ascii="Consolas" w:hAnsi="Consolas"/>
+          <w:color w:val="A03030"/>
+          <w:sz w:val="19"/>
+        </w:rPr>
+        <w:t>app.js</w:t>
+      </w:r>
+      <w:r>
+        <w:t xml:space="preserve"> (1659) → </w:t>
+      </w:r>
+      <w:r>
+        <w:rPr>
+          <w:rFonts w:ascii="Consolas" w:hAnsi="Consolas"/>
+          <w:color w:val="A03030"/>
+          <w:sz w:val="19"/>
+        </w:rPr>
+        <w:t>app-core / -grid / -person / -admin / -track / -log / -report / -boot.js</w:t>
+      </w:r>
+      <w:r>
+        <w:t xml:space="preserve">. </w:t>
+      </w:r>
+      <w:r>
+        <w:rPr>
+          <w:rFonts w:ascii="Consolas" w:hAnsi="Consolas"/>
+          <w:color w:val="A03030"/>
+          <w:sz w:val="19"/>
+        </w:rPr>
+        <w:t>styles.css</w:t>
+      </w:r>
+      <w:r>
+        <w:t xml:space="preserve"> (1486) → 9 </w:t>
+      </w:r>
+      <w:r>
+        <w:rPr>
+          <w:rFonts w:ascii="Consolas" w:hAnsi="Consolas"/>
+          <w:color w:val="A03030"/>
+          <w:sz w:val="19"/>
+        </w:rPr>
+        <w:t>styles/*.css</w:t>
+      </w:r>
+      <w:r>
+        <w:t xml:space="preserve"> linked in cascade order.</w:t>
+      </w:r>
+    </w:p>
+    <w:tbl>
+      <w:tblPr>
+        <w:tblStyle w:val="TableGrid"/>
+        <w:tblW w:type="auto" w:w="0"/>
+        <w:tblLook w:firstColumn="1" w:firstRow="1" w:lastColumn="0" w:lastRow="0" w:noHBand="0" w:noVBand="1" w:val="04A0"/>
+      </w:tblPr>
+      <w:tblGrid>
+        <w:gridCol w:w="9792"/>
+      </w:tblGrid>
+      <w:tr>
+        <w:tc>
+          <w:tcPr>
+            <w:tcW w:type="dxa" w:w="9792"/>
+            <w:shd w:val="clear" w:fill="FDECEA"/>
+          </w:tcPr>
+          <w:p>
+            <w:pPr>
+              <w:spacing w:after="40" w:before="20"/>
+            </w:pPr>
+            <w:r>
+              <w:rPr>
+                <w:b/>
+                <w:color w:val="B00020"/>
+                <w:sz w:val="18"/>
+              </w:rPr>
+              <w:t>GOTCHA</w:t>
+            </w:r>
+          </w:p>
+          <w:p>
+            <w:pPr>
+              <w:spacing w:after="0" w:before="20"/>
+            </w:pPr>
+            <w:r>
+              <w:rPr>
+                <w:rFonts w:ascii="Consolas" w:hAnsi="Consolas"/>
+                <w:b/>
+                <w:color w:val="A03030"/>
+                <w:sz w:val="19"/>
+              </w:rPr>
+              <w:t>app-boot.js</w:t>
+            </w:r>
+            <w:r>
+              <w:rPr>
+                <w:b/>
+              </w:rPr>
+              <w:t xml:space="preserve"> MUST load last.</w:t>
+            </w:r>
+            <w:r>
+              <w:t xml:space="preserve"> It holds the top-level wiring (</w:t>
             </w:r>
             <w:r>
               <w:rPr>
@@ -10870,10 +10939,154 @@
                 <w:color w:val="A03030"/>
                 <w:sz w:val="19"/>
               </w:rPr>
-              <w:t>app.js</w:t>
-            </w:r>
-            <w:r>
-              <w:t xml:space="preserve"> had been reverted to an older photo modal (</w:t>
+              <w:t>setInterval(pollFeeds…)</w:t>
+            </w:r>
+            <w:r>
+              <w:t>, the clock, fullscreen listeners, the background IIFE) that relied on function hoisting within the single file — splitting broke hoisting across files, so those statements moved to boot. Any NEW top-level side-effect statement belongs in app-boot.js, not a feature file.</w:t>
+            </w:r>
+          </w:p>
+        </w:tc>
+      </w:tr>
+    </w:tbl>
+    <w:p>
+      <w:pPr>
+        <w:spacing w:after="40"/>
+      </w:pPr>
+    </w:p>
+    <w:p>
+      <w:pPr>
+        <w:pStyle w:val="Heading2"/>
+      </w:pPr>
+      <w:r>
+        <w:t>19.3 pipeline.py — sibling helper modules</w:t>
+      </w:r>
+    </w:p>
+    <w:p>
+      <w:r>
+        <w:t xml:space="preserve">The stateless helpers were extracted to flat siblings and imported back (688 → 508 lines): </w:t>
+      </w:r>
+      <w:r>
+        <w:rPr>
+          <w:rFonts w:ascii="Consolas" w:hAnsi="Consolas"/>
+          <w:color w:val="A03030"/>
+          <w:sz w:val="19"/>
+        </w:rPr>
+        <w:t>ppl_colors.py</w:t>
+      </w:r>
+      <w:r>
+        <w:t xml:space="preserve"> (shared box colours), </w:t>
+      </w:r>
+      <w:r>
+        <w:rPr>
+          <w:rFonts w:ascii="Consolas" w:hAnsi="Consolas"/>
+          <w:color w:val="A03030"/>
+          <w:sz w:val="19"/>
+        </w:rPr>
+        <w:t>geometry.py</w:t>
+      </w:r>
+      <w:r>
+        <w:t xml:space="preserve"> (IoU/overlap/occlusion/label), </w:t>
+      </w:r>
+      <w:r>
+        <w:rPr>
+          <w:rFonts w:ascii="Consolas" w:hAnsi="Consolas"/>
+          <w:color w:val="A03030"/>
+          <w:sz w:val="19"/>
+        </w:rPr>
+        <w:t>snapshots.py</w:t>
+      </w:r>
+      <w:r>
+        <w:t xml:space="preserve"> (crop/sharpness/pooling + save_* + storage constants), </w:t>
+      </w:r>
+      <w:r>
+        <w:rPr>
+          <w:rFonts w:ascii="Consolas" w:hAnsi="Consolas"/>
+          <w:color w:val="A03030"/>
+          <w:sz w:val="19"/>
+        </w:rPr>
+        <w:t>payload.py</w:t>
+      </w:r>
+      <w:r>
+        <w:t xml:space="preserve"> (timestamp / Brain-label mapping / payload builder + </w:t>
+      </w:r>
+      <w:r>
+        <w:rPr>
+          <w:rFonts w:ascii="Consolas" w:hAnsi="Consolas"/>
+          <w:color w:val="A03030"/>
+          <w:sz w:val="19"/>
+        </w:rPr>
+        <w:t>_RUN_EPOCH</w:t>
+      </w:r>
+      <w:r>
+        <w:t xml:space="preserve">). The threads, module globals and </w:t>
+      </w:r>
+      <w:r>
+        <w:rPr>
+          <w:rFonts w:ascii="Consolas" w:hAnsi="Consolas"/>
+          <w:color w:val="A03030"/>
+          <w:sz w:val="19"/>
+        </w:rPr>
+        <w:t>main()</w:t>
+      </w:r>
+      <w:r>
+        <w:t xml:space="preserve"> stayed in pipeline.py by design (they own the shared perception state).</w:t>
+      </w:r>
+    </w:p>
+    <w:p>
+      <w:pPr>
+        <w:pBdr>
+          <w:bottom w:val="single" w:sz="6" w:space="1" w:color="2E7D32"/>
+        </w:pBdr>
+      </w:pPr>
+    </w:p>
+    <w:p>
+      <w:pPr>
+        <w:pStyle w:val="Heading1"/>
+      </w:pPr>
+      <w:r>
+        <w:t>20. Recent Changes Log (2026-07-15 / 16)</w:t>
+      </w:r>
+    </w:p>
+    <w:tbl>
+      <w:tblPr>
+        <w:tblStyle w:val="TableGrid"/>
+        <w:tblW w:type="auto" w:w="0"/>
+        <w:tblLook w:firstColumn="1" w:firstRow="1" w:lastColumn="0" w:lastRow="0" w:noHBand="0" w:noVBand="1" w:val="04A0"/>
+      </w:tblPr>
+      <w:tblGrid>
+        <w:gridCol w:w="9792"/>
+      </w:tblGrid>
+      <w:tr>
+        <w:tc>
+          <w:tcPr>
+            <w:tcW w:type="dxa" w:w="9792"/>
+            <w:shd w:val="clear" w:fill="E6F4EA"/>
+          </w:tcPr>
+          <w:p>
+            <w:pPr>
+              <w:spacing w:after="40" w:before="20"/>
+            </w:pPr>
+            <w:r>
+              <w:rPr>
+                <w:b/>
+                <w:color w:val="2E7D32"/>
+                <w:sz w:val="18"/>
+              </w:rPr>
+              <w:t>FIXED</w:t>
+            </w:r>
+          </w:p>
+          <w:p>
+            <w:pPr>
+              <w:spacing w:after="0" w:before="20"/>
+            </w:pPr>
+            <w:r>
+              <w:rPr>
+                <w:b/>
+              </w:rPr>
+              <w:t>Unknown visitors weren't logging.</w:t>
+            </w:r>
+            <w:r>
+              <w:t xml:space="preserve"> The </w:t>
             </w:r>
             <w:r>
               <w:rPr>
@@ -10881,10 +11094,10 @@
                 <w:color w:val="A03030"/>
                 <w:sz w:val="19"/>
               </w:rPr>
-              <w:t>_showTriple</w:t>
-            </w:r>
-            <w:r>
-              <w:t xml:space="preserve">, </w:t>
+              <w:t>f8779ae</w:t>
+            </w:r>
+            <w:r>
+              <w:t xml:space="preserve"> refactor dropped the </w:t>
             </w:r>
             <w:r>
               <w:rPr>
@@ -10892,10 +11105,10 @@
                 <w:color w:val="A03030"/>
                 <w:sz w:val="19"/>
               </w:rPr>
-              <w:t>photo-*-fig</w:t>
-            </w:r>
-            <w:r>
-              <w:t xml:space="preserve"> ids) while </w:t>
+              <w:t>DetectionEvent</w:t>
+            </w:r>
+            <w:r>
+              <w:t xml:space="preserve"> evidence columns + </w:t>
             </w:r>
             <w:r>
               <w:rPr>
@@ -10903,10 +11116,32 @@
                 <w:color w:val="A03030"/>
                 <w:sz w:val="19"/>
               </w:rPr>
-              <w:t>index.html</w:t>
-            </w:r>
-            <w:r>
-              <w:t xml:space="preserve"> was on the newer carousel — the modal looked up elements that didn't exist. Realigned index.html to the triple-figure modal app.js expects.</w:t>
+              <w:t>UnknownCase</w:t>
+            </w:r>
+            <w:r>
+              <w:t xml:space="preserve"> from the ORM but left </w:t>
+            </w:r>
+            <w:r>
+              <w:rPr>
+                <w:rFonts w:ascii="Consolas" w:hAnsi="Consolas"/>
+                <w:color w:val="A03030"/>
+                <w:sz w:val="19"/>
+              </w:rPr>
+              <w:t>event_repo</w:t>
+            </w:r>
+            <w:r>
+              <w:t xml:space="preserve"> writing them → every </w:t>
+            </w:r>
+            <w:r>
+              <w:rPr>
+                <w:rFonts w:ascii="Consolas" w:hAnsi="Consolas"/>
+                <w:color w:val="A03030"/>
+                <w:sz w:val="19"/>
+              </w:rPr>
+              <w:t>POST /events</w:t>
+            </w:r>
+            <w:r>
+              <w:t xml:space="preserve"> returned 500; the pipeline masked it as an on-frame “Unknown”. Restored the ORM columns + model to match the live DB (no migration needed). Verified: a body-only Unknown now logs.</w:t>
             </w:r>
           </w:p>
         </w:tc>
@@ -10953,7 +11188,7 @@
               <w:rPr>
                 <w:b/>
               </w:rPr>
-              <w:t>“Make employee” button failed (HTTP 500).</w:t>
+              <w:t>Photos not showing in the log.</w:t>
             </w:r>
             <w:r>
               <w:t xml:space="preserve"> </w:t>
@@ -10964,10 +11199,10 @@
                 <w:color w:val="A03030"/>
                 <w:sz w:val="19"/>
               </w:rPr>
-              <w:t>identity_repo.insert_employee</w:t>
-            </w:r>
-            <w:r>
-              <w:t xml:space="preserve"> wrote </w:t>
+              <w:t>app.js</w:t>
+            </w:r>
+            <w:r>
+              <w:t xml:space="preserve"> had been reverted to an older photo modal (</w:t>
             </w:r>
             <w:r>
               <w:rPr>
@@ -10975,10 +11210,10 @@
                 <w:color w:val="A03030"/>
                 <w:sz w:val="19"/>
               </w:rPr>
-              <w:t>Employee.external_id</w:t>
-            </w:r>
-            <w:r>
-              <w:t xml:space="preserve">, a column the refactor had removed from the ORM. Restored the column + </w:t>
+              <w:t>_showTriple</w:t>
+            </w:r>
+            <w:r>
+              <w:t xml:space="preserve">, </w:t>
             </w:r>
             <w:r>
               <w:rPr>
@@ -10986,10 +11221,21 @@
                 <w:color w:val="A03030"/>
                 <w:sz w:val="19"/>
               </w:rPr>
-              <w:t>uq_employees_external_id</w:t>
-            </w:r>
-            <w:r>
-              <w:t>. Verified promote/demote end-to-end.</w:t>
+              <w:t>photo-*-fig</w:t>
+            </w:r>
+            <w:r>
+              <w:t xml:space="preserve"> ids) while </w:t>
+            </w:r>
+            <w:r>
+              <w:rPr>
+                <w:rFonts w:ascii="Consolas" w:hAnsi="Consolas"/>
+                <w:color w:val="A03030"/>
+                <w:sz w:val="19"/>
+              </w:rPr>
+              <w:t>index.html</w:t>
+            </w:r>
+            <w:r>
+              <w:t xml:space="preserve"> was on the newer carousel — the modal looked up elements that didn't exist. Realigned index.html to the triple-figure modal app.js expects.</w:t>
             </w:r>
           </w:p>
         </w:tc>
@@ -11036,10 +11282,10 @@
               <w:rPr>
                 <w:b/>
               </w:rPr>
-              <w:t>Face detector swapped MTCNN → SCRFD.</w:t>
-            </w:r>
-            <w:r>
-              <w:t xml:space="preserve"> New </w:t>
+              <w:t>“Make employee” button failed (HTTP 500).</w:t>
+            </w:r>
+            <w:r>
+              <w:t xml:space="preserve"> </w:t>
             </w:r>
             <w:r>
               <w:rPr>
@@ -11047,10 +11293,10 @@
                 <w:color w:val="A03030"/>
                 <w:sz w:val="19"/>
               </w:rPr>
-              <w:t>feature_id/scrfd_detector.py</w:t>
-            </w:r>
-            <w:r>
-              <w:t xml:space="preserve"> (onnxruntime), switchable via </w:t>
+              <w:t>identity_repo.insert_employee</w:t>
+            </w:r>
+            <w:r>
+              <w:t xml:space="preserve"> wrote </w:t>
             </w:r>
             <w:r>
               <w:rPr>
@@ -11058,10 +11304,21 @@
                 <w:color w:val="A03030"/>
                 <w:sz w:val="19"/>
               </w:rPr>
-              <w:t>FACE_DETECTOR</w:t>
-            </w:r>
-            <w:r>
-              <w:t>. On real crops SCRFD matched MTCNN and found one face MTCNN missed. Recognition still AdaFace.</w:t>
+              <w:t>Employee.external_id</w:t>
+            </w:r>
+            <w:r>
+              <w:t xml:space="preserve">, a column the refactor had removed from the ORM. Restored the column + </w:t>
+            </w:r>
+            <w:r>
+              <w:rPr>
+                <w:rFonts w:ascii="Consolas" w:hAnsi="Consolas"/>
+                <w:color w:val="A03030"/>
+                <w:sz w:val="19"/>
+              </w:rPr>
+              <w:t>uq_employees_external_id</w:t>
+            </w:r>
+            <w:r>
+              <w:t>. Verified promote/demote end-to-end.</w:t>
             </w:r>
           </w:p>
         </w:tc>
@@ -11108,10 +11365,32 @@
               <w:rPr>
                 <w:b/>
               </w:rPr>
-              <w:t>Modularization</w:t>
-            </w:r>
-            <w:r>
-              <w:t xml:space="preserve"> of the seven largest files (§19) — behaviour-preserving, verified.</w:t>
+              <w:t>Face detector swapped MTCNN → SCRFD.</w:t>
+            </w:r>
+            <w:r>
+              <w:t xml:space="preserve"> New </w:t>
+            </w:r>
+            <w:r>
+              <w:rPr>
+                <w:rFonts w:ascii="Consolas" w:hAnsi="Consolas"/>
+                <w:color w:val="A03030"/>
+                <w:sz w:val="19"/>
+              </w:rPr>
+              <w:t>feature_id/scrfd_detector.py</w:t>
+            </w:r>
+            <w:r>
+              <w:t xml:space="preserve"> (onnxruntime), switchable via </w:t>
+            </w:r>
+            <w:r>
+              <w:rPr>
+                <w:rFonts w:ascii="Consolas" w:hAnsi="Consolas"/>
+                <w:color w:val="A03030"/>
+                <w:sz w:val="19"/>
+              </w:rPr>
+              <w:t>FACE_DETECTOR</w:t>
+            </w:r>
+            <w:r>
+              <w:t>. On real crops SCRFD matched MTCNN and found one face MTCNN missed. Recognition still AdaFace.</w:t>
             </w:r>
           </w:p>
         </w:tc>
@@ -11158,6 +11437,56 @@
               <w:rPr>
                 <w:b/>
               </w:rPr>
+              <w:t>Modularization</w:t>
+            </w:r>
+            <w:r>
+              <w:t xml:space="preserve"> of the seven largest files (§19) — behaviour-preserving, verified.</w:t>
+            </w:r>
+          </w:p>
+        </w:tc>
+      </w:tr>
+    </w:tbl>
+    <w:p>
+      <w:pPr>
+        <w:spacing w:after="40"/>
+      </w:pPr>
+    </w:p>
+    <w:tbl>
+      <w:tblPr>
+        <w:tblStyle w:val="TableGrid"/>
+        <w:tblW w:type="auto" w:w="0"/>
+        <w:tblLook w:firstColumn="1" w:firstRow="1" w:lastColumn="0" w:lastRow="0" w:noHBand="0" w:noVBand="1" w:val="04A0"/>
+      </w:tblPr>
+      <w:tblGrid>
+        <w:gridCol w:w="9792"/>
+      </w:tblGrid>
+      <w:tr>
+        <w:tc>
+          <w:tcPr>
+            <w:tcW w:type="dxa" w:w="9792"/>
+            <w:shd w:val="clear" w:fill="E6F4EA"/>
+          </w:tcPr>
+          <w:p>
+            <w:pPr>
+              <w:spacing w:after="40" w:before="20"/>
+            </w:pPr>
+            <w:r>
+              <w:rPr>
+                <w:b/>
+                <w:color w:val="2E7D32"/>
+                <w:sz w:val="18"/>
+              </w:rPr>
+              <w:t>FIXED</w:t>
+            </w:r>
+          </w:p>
+          <w:p>
+            <w:pPr>
+              <w:spacing w:after="0" w:before="20"/>
+            </w:pPr>
+            <w:r>
+              <w:rPr>
+                <w:b/>
+              </w:rPr>
               <w:t>UI background disappeared after the CSS split</w:t>
             </w:r>
             <w:r>
@@ -11195,6 +11524,162 @@
             </w:r>
             <w:r>
               <w:t>.</w:t>
+            </w:r>
+          </w:p>
+        </w:tc>
+      </w:tr>
+    </w:tbl>
+    <w:p>
+      <w:pPr>
+        <w:spacing w:after="40"/>
+      </w:pPr>
+    </w:p>
+    <w:tbl>
+      <w:tblPr>
+        <w:tblStyle w:val="TableGrid"/>
+        <w:tblW w:type="auto" w:w="0"/>
+        <w:tblLook w:firstColumn="1" w:firstRow="1" w:lastColumn="0" w:lastRow="0" w:noHBand="0" w:noVBand="1" w:val="04A0"/>
+      </w:tblPr>
+      <w:tblGrid>
+        <w:gridCol w:w="9792"/>
+      </w:tblGrid>
+      <w:tr>
+        <w:tc>
+          <w:tcPr>
+            <w:tcW w:type="dxa" w:w="9792"/>
+            <w:shd w:val="clear" w:fill="E6F4EA"/>
+          </w:tcPr>
+          <w:p>
+            <w:pPr>
+              <w:spacing w:after="40" w:before="20"/>
+            </w:pPr>
+            <w:r>
+              <w:rPr>
+                <w:b/>
+                <w:color w:val="2E7D32"/>
+                <w:sz w:val="18"/>
+              </w:rPr>
+              <w:t>FIXED</w:t>
+            </w:r>
+          </w:p>
+          <w:p>
+            <w:pPr>
+              <w:spacing w:after="0" w:before="20"/>
+            </w:pPr>
+            <w:r>
+              <w:rPr>
+                <w:b/>
+              </w:rPr>
+              <w:t>Photos / faces vanishing + storage blowing the cap (Tier A/B storage rework — §17).</w:t>
+            </w:r>
+            <w:r>
+              <w:t xml:space="preserve"> Root cause: the UI's identity photo *was* the newest sighting's snapshot file, so the 5 GB size-cap pruner (deleting oldest-first) stripped people's faces; and event ROWS were pruned at 7 days (movement-history loss). Fix: (1) </w:t>
+            </w:r>
+            <w:r>
+              <w:rPr>
+                <w:b/>
+              </w:rPr>
+              <w:t>Tier A</w:t>
+            </w:r>
+            <w:r>
+              <w:t xml:space="preserve"> — a durable </w:t>
+            </w:r>
+            <w:r>
+              <w:rPr>
+                <w:rFonts w:ascii="Consolas" w:hAnsi="Consolas"/>
+                <w:color w:val="A03030"/>
+                <w:sz w:val="19"/>
+              </w:rPr>
+              <w:t>storage/profiles/&lt;id&gt;.jpg</w:t>
+            </w:r>
+            <w:r>
+              <w:t xml:space="preserve"> per identity, written by the pipeline (</w:t>
+            </w:r>
+            <w:r>
+              <w:rPr>
+                <w:rFonts w:ascii="Consolas" w:hAnsi="Consolas"/>
+                <w:color w:val="A03030"/>
+                <w:sz w:val="19"/>
+              </w:rPr>
+              <w:t>snapshots.save_profile_photo</w:t>
+            </w:r>
+            <w:r>
+              <w:t>), surfaced by the Brain (</w:t>
+            </w:r>
+            <w:r>
+              <w:rPr>
+                <w:rFonts w:ascii="Consolas" w:hAnsi="Consolas"/>
+                <w:color w:val="A03030"/>
+                <w:sz w:val="19"/>
+              </w:rPr>
+              <w:t>services/media_paths.profile_rel</w:t>
+            </w:r>
+            <w:r>
+              <w:t xml:space="preserve">) and preferred by the UI </w:t>
+            </w:r>
+            <w:r>
+              <w:rPr>
+                <w:rFonts w:ascii="Consolas" w:hAnsi="Consolas"/>
+                <w:color w:val="A03030"/>
+                <w:sz w:val="19"/>
+              </w:rPr>
+              <w:t>photoFor()</w:t>
+            </w:r>
+            <w:r>
+              <w:t xml:space="preserve">; it lives outside </w:t>
+            </w:r>
+            <w:r>
+              <w:rPr>
+                <w:rFonts w:ascii="Consolas" w:hAnsi="Consolas"/>
+                <w:color w:val="A03030"/>
+                <w:sz w:val="19"/>
+              </w:rPr>
+              <w:t>storage/img</w:t>
+            </w:r>
+            <w:r>
+              <w:t xml:space="preserve"> so the pruner never touches it. (2) </w:t>
+            </w:r>
+            <w:r>
+              <w:rPr>
+                <w:b/>
+              </w:rPr>
+              <w:t>Tier B</w:t>
+            </w:r>
+            <w:r>
+              <w:t xml:space="preserve"> — split retention: </w:t>
+            </w:r>
+            <w:r>
+              <w:rPr>
+                <w:rFonts w:ascii="Consolas" w:hAnsi="Consolas"/>
+                <w:color w:val="A03030"/>
+                <w:sz w:val="19"/>
+              </w:rPr>
+              <w:t>MEDIA_RETENTION_DAYS</w:t>
+            </w:r>
+            <w:r>
+              <w:t xml:space="preserve">=30 + </w:t>
+            </w:r>
+            <w:r>
+              <w:rPr>
+                <w:rFonts w:ascii="Consolas" w:hAnsi="Consolas"/>
+                <w:color w:val="A03030"/>
+                <w:sz w:val="19"/>
+              </w:rPr>
+              <w:t>STORAGE_MAX_GB</w:t>
+            </w:r>
+            <w:r>
+              <w:t xml:space="preserve">=50 for sighting JPEGs, </w:t>
+            </w:r>
+            <w:r>
+              <w:rPr>
+                <w:rFonts w:ascii="Consolas" w:hAnsi="Consolas"/>
+                <w:color w:val="A03030"/>
+                <w:sz w:val="19"/>
+              </w:rPr>
+              <w:t>EVENT_RETENTION_DAYS</w:t>
+            </w:r>
+            <w:r>
+              <w:t>=365 for DB rows. Backfilled durable photos for 739 existing identities; verified the pruner leaves profiles untouched and the pipeline writes new ones live.</w:t>
             </w:r>
           </w:p>
         </w:tc>
@@ -11437,6 +11922,117 @@
       </w:r>
       <w:r>
         <w:t xml:space="preserve"> (§20): inflated people/event counts until thresholds are tightened.</w:t>
+      </w:r>
+    </w:p>
+    <w:p>
+      <w:pPr>
+        <w:pStyle w:val="ListBullet"/>
+      </w:pPr>
+      <w:r>
+        <w:rPr>
+          <w:b/>
+        </w:rPr>
+        <w:t>Archive backstop OFF in native mode:</w:t>
+      </w:r>
+      <w:r>
+        <w:t xml:space="preserve"> </w:t>
+      </w:r>
+      <w:r>
+        <w:rPr>
+          <w:rFonts w:ascii="Consolas" w:hAnsi="Consolas"/>
+          <w:color w:val="A03030"/>
+          <w:sz w:val="19"/>
+        </w:rPr>
+        <w:t>run.sh</w:t>
+      </w:r>
+      <w:r>
+        <w:t xml:space="preserve"> starts the Brain with </w:t>
+      </w:r>
+      <w:r>
+        <w:rPr>
+          <w:rFonts w:ascii="Consolas" w:hAnsi="Consolas"/>
+          <w:color w:val="A03030"/>
+          <w:sz w:val="19"/>
+        </w:rPr>
+        <w:t>ENABLE_MIDNIGHT_FLUSH=0</w:t>
+      </w:r>
+      <w:r>
+        <w:t xml:space="preserve">, which also disables </w:t>
+      </w:r>
+      <w:r>
+        <w:rPr>
+          <w:rFonts w:ascii="Consolas" w:hAnsi="Consolas"/>
+          <w:color w:val="A03030"/>
+          <w:sz w:val="19"/>
+        </w:rPr>
+        <w:t>archive_service</w:t>
+      </w:r>
+      <w:r>
+        <w:t xml:space="preserve"> (the JSONL export of every event). With 365-day row retention the pruning risk is low, but an explicit purge (</w:t>
+      </w:r>
+      <w:r>
+        <w:rPr>
+          <w:rFonts w:ascii="Consolas" w:hAnsi="Consolas"/>
+          <w:color w:val="A03030"/>
+          <w:sz w:val="19"/>
+        </w:rPr>
+        <w:t>/identities/delete</w:t>
+      </w:r>
+      <w:r>
+        <w:t>→</w:t>
+      </w:r>
+      <w:r>
+        <w:rPr>
+          <w:rFonts w:ascii="Consolas" w:hAnsi="Consolas"/>
+          <w:color w:val="A03030"/>
+          <w:sz w:val="19"/>
+        </w:rPr>
+        <w:t>purge_identity</w:t>
+      </w:r>
+      <w:r>
+        <w:t xml:space="preserve">, the card's delete/erase button) or </w:t>
+      </w:r>
+      <w:r>
+        <w:rPr>
+          <w:rFonts w:ascii="Consolas" w:hAnsi="Consolas"/>
+          <w:color w:val="A03030"/>
+          <w:sz w:val="19"/>
+        </w:rPr>
+        <w:t>/admin/reset</w:t>
+      </w:r>
+      <w:r>
+        <w:t xml:space="preserve"> is </w:t>
+      </w:r>
+      <w:r>
+        <w:rPr>
+          <w:b/>
+        </w:rPr>
+        <w:t>irrecoverable</w:t>
+      </w:r>
+      <w:r>
+        <w:t xml:space="preserve"> — there is no continuous archive process. Adding a standalone archive process to run.sh (like </w:t>
+      </w:r>
+      <w:r>
+        <w:rPr>
+          <w:rFonts w:ascii="Consolas" w:hAnsi="Consolas"/>
+          <w:color w:val="A03030"/>
+          <w:sz w:val="19"/>
+        </w:rPr>
+        <w:t>prune</w:t>
+      </w:r>
+      <w:r>
+        <w:t>/</w:t>
+      </w:r>
+      <w:r>
+        <w:rPr>
+          <w:rFonts w:ascii="Consolas" w:hAnsi="Consolas"/>
+          <w:color w:val="A03030"/>
+          <w:sz w:val="19"/>
+        </w:rPr>
+        <w:t>dbprune</w:t>
+      </w:r>
+      <w:r>
+        <w:t>) would restore the safety net.</w:t>
       </w:r>
     </w:p>
     <w:tbl>
@@ -12216,6 +12812,84 @@
                 <w:sz w:val="17"/>
               </w:rPr>
               <w:t>ingestion, dedup, calibration, session_tracker, presence_cache, enrollment, log, search, live_broadcaster, archive, conversion, feature_matcher</w:t>
+            </w:r>
+          </w:p>
+        </w:tc>
+      </w:tr>
+      <w:tr>
+        <w:tc>
+          <w:tcPr>
+            <w:tcW w:type="dxa" w:w="4896"/>
+          </w:tcPr>
+          <w:p>
+            <w:r>
+              <w:rPr>
+                <w:sz w:val="17"/>
+              </w:rPr>
+            </w:r>
+            <w:r>
+              <w:rPr>
+                <w:sz w:val="17"/>
+              </w:rPr>
+              <w:t>surveillance_brain/services/media_paths.py</w:t>
+            </w:r>
+          </w:p>
+        </w:tc>
+        <w:tc>
+          <w:tcPr>
+            <w:tcW w:type="dxa" w:w="4320"/>
+          </w:tcPr>
+          <w:p>
+            <w:r>
+              <w:rPr>
+                <w:sz w:val="17"/>
+              </w:rPr>
+            </w:r>
+            <w:r>
+              <w:rPr>
+                <w:sz w:val="17"/>
+              </w:rPr>
+              <w:t>durable Tier-A profile-photo path resolver</w:t>
+            </w:r>
+          </w:p>
+        </w:tc>
+      </w:tr>
+      <w:tr>
+        <w:tc>
+          <w:tcPr>
+            <w:tcW w:type="dxa" w:w="4896"/>
+            <w:shd w:val="clear" w:fill="F3F7F3"/>
+          </w:tcPr>
+          <w:p>
+            <w:r>
+              <w:rPr>
+                <w:sz w:val="17"/>
+              </w:rPr>
+            </w:r>
+            <w:r>
+              <w:rPr>
+                <w:sz w:val="17"/>
+              </w:rPr>
+              <w:t>surveillance_AI/snapshots.py :: save_profile_photo</w:t>
+            </w:r>
+          </w:p>
+        </w:tc>
+        <w:tc>
+          <w:tcPr>
+            <w:tcW w:type="dxa" w:w="4320"/>
+            <w:shd w:val="clear" w:fill="F3F7F3"/>
+          </w:tcPr>
+          <w:p>
+            <w:r>
+              <w:rPr>
+                <w:sz w:val="17"/>
+              </w:rPr>
+            </w:r>
+            <w:r>
+              <w:rPr>
+                <w:sz w:val="17"/>
+              </w:rPr>
+              <w:t>writes storage/profiles/&lt;id&gt;.jpg (Tier A, never pruned)</w:t>
             </w:r>
           </w:p>
         </w:tc>

</xml_diff>